<commit_message>
Saved tables for all phenotype measurement assays, in respective .docx files.
</commit_message>
<xml_diff>
--- a/Flight_Exp_Evo_1/Tables/fecundity_tables.docx
+++ b/Flight_Exp_Evo_1/Tables/fecundity_tables.docx
@@ -49,7 +49,7 @@
           <w:sz w:val="24"/>
           <w:color w:val="333333"/>
         </w:rPr>
-        <w:t xml:space="default">AICc results for models fit for per capita fecundity</w:t>
+        <w:t xml:space="default">AICc results for models fit for fecundity assay (log fecundity)</w:t>
       </w:r>
     </w:p>
     <w:tbl xmlns:w="http://schemas.openxmlformats.org/wordprocessingml/2006/main" xmlns:wp="http://schemas.openxmlformats.org/drawingml/2006/wordprocessingDrawing" xmlns:r="http://schemas.openxmlformats.org/officeDocument/2006/relationships" xmlns:w14="http://schemas.microsoft.com/office/word/2010/wordml">
@@ -252,103 +252,103 @@
                 <w:rFonts w:ascii="Calibri" w:hAnsi="Calibri"/>
                 <w:sz w:val="20"/>
               </w:rPr>
-              <w:t xml:space="default">4.000</w:t>
-            </w:r>
-          </w:p>
-        </w:tc>
-        <w:tc>
-          <w:tcPr>
-            <w:tcBorders>
-              <w:top w:val="single" w:space="0" w:color="D3D3D3"/>
-              <w:bottom w:val="single" w:space="0" w:color="D3D3D3"/>
-              <w:start w:val="single" w:space="0" w:color="D3D3D3"/>
-              <w:end w:val="single" w:space="0" w:color="D3D3D3"/>
-            </w:tcBorders>
-          </w:tcPr>
-          <w:p>
-            <w:pPr>
-              <w:spacing w:before="0" w:after="60"/>
-              <w:keepNext/>
-              <w:jc w:val="start"/>
-            </w:pPr>
-            <w:r>
-              <w:rPr>
-                <w:rFonts w:ascii="Calibri" w:hAnsi="Calibri"/>
-                <w:sz w:val="20"/>
-              </w:rPr>
-              <w:t xml:space="default">102.758</w:t>
-            </w:r>
-          </w:p>
-        </w:tc>
-        <w:tc>
-          <w:tcPr>
-            <w:tcBorders>
-              <w:top w:val="single" w:space="0" w:color="D3D3D3"/>
-              <w:bottom w:val="single" w:space="0" w:color="D3D3D3"/>
-              <w:start w:val="single" w:space="0" w:color="D3D3D3"/>
-              <w:end w:val="single" w:space="0" w:color="D3D3D3"/>
-            </w:tcBorders>
-          </w:tcPr>
-          <w:p>
-            <w:pPr>
-              <w:spacing w:before="0" w:after="60"/>
-              <w:keepNext/>
-              <w:jc w:val="start"/>
-            </w:pPr>
-            <w:r>
-              <w:rPr>
-                <w:rFonts w:ascii="Calibri" w:hAnsi="Calibri"/>
-                <w:sz w:val="20"/>
-              </w:rPr>
-              <w:t xml:space="default">0.000</w:t>
-            </w:r>
-          </w:p>
-        </w:tc>
-        <w:tc>
-          <w:tcPr>
-            <w:tcBorders>
-              <w:top w:val="single" w:space="0" w:color="D3D3D3"/>
-              <w:bottom w:val="single" w:space="0" w:color="D3D3D3"/>
-              <w:start w:val="single" w:space="0" w:color="D3D3D3"/>
-              <w:end w:val="single" w:space="0" w:color="D3D3D3"/>
-            </w:tcBorders>
-          </w:tcPr>
-          <w:p>
-            <w:pPr>
-              <w:spacing w:before="0" w:after="60"/>
-              <w:keepNext/>
-              <w:jc w:val="start"/>
-            </w:pPr>
-            <w:r>
-              <w:rPr>
-                <w:rFonts w:ascii="Calibri" w:hAnsi="Calibri"/>
-                <w:sz w:val="20"/>
-              </w:rPr>
-              <w:t xml:space="default">0.993</w:t>
-            </w:r>
-          </w:p>
-        </w:tc>
-        <w:tc>
-          <w:tcPr>
-            <w:tcBorders>
-              <w:top w:val="single" w:space="0" w:color="D3D3D3"/>
-              <w:bottom w:val="single" w:space="0" w:color="D3D3D3"/>
-              <w:start w:val="single" w:space="0" w:color="D3D3D3"/>
-              <w:end w:val="single" w:space="0" w:color="D3D3D3"/>
-            </w:tcBorders>
-          </w:tcPr>
-          <w:p>
-            <w:pPr>
-              <w:spacing w:before="0" w:after="60"/>
-              <w:keepNext/>
-              <w:jc w:val="start"/>
-            </w:pPr>
-            <w:r>
-              <w:rPr>
-                <w:rFonts w:ascii="Calibri" w:hAnsi="Calibri"/>
-                <w:sz w:val="20"/>
-              </w:rPr>
-              <w:t xml:space="default">-46.326</w:t>
+              <w:t xml:space="default">4.0000</w:t>
+            </w:r>
+          </w:p>
+        </w:tc>
+        <w:tc>
+          <w:tcPr>
+            <w:tcBorders>
+              <w:top w:val="single" w:space="0" w:color="D3D3D3"/>
+              <w:bottom w:val="single" w:space="0" w:color="D3D3D3"/>
+              <w:start w:val="single" w:space="0" w:color="D3D3D3"/>
+              <w:end w:val="single" w:space="0" w:color="D3D3D3"/>
+            </w:tcBorders>
+          </w:tcPr>
+          <w:p>
+            <w:pPr>
+              <w:spacing w:before="0" w:after="60"/>
+              <w:keepNext/>
+              <w:jc w:val="start"/>
+            </w:pPr>
+            <w:r>
+              <w:rPr>
+                <w:rFonts w:ascii="Calibri" w:hAnsi="Calibri"/>
+                <w:sz w:val="20"/>
+              </w:rPr>
+              <w:t xml:space="default">102.7577</w:t>
+            </w:r>
+          </w:p>
+        </w:tc>
+        <w:tc>
+          <w:tcPr>
+            <w:tcBorders>
+              <w:top w:val="single" w:space="0" w:color="D3D3D3"/>
+              <w:bottom w:val="single" w:space="0" w:color="D3D3D3"/>
+              <w:start w:val="single" w:space="0" w:color="D3D3D3"/>
+              <w:end w:val="single" w:space="0" w:color="D3D3D3"/>
+            </w:tcBorders>
+          </w:tcPr>
+          <w:p>
+            <w:pPr>
+              <w:spacing w:before="0" w:after="60"/>
+              <w:keepNext/>
+              <w:jc w:val="start"/>
+            </w:pPr>
+            <w:r>
+              <w:rPr>
+                <w:rFonts w:ascii="Calibri" w:hAnsi="Calibri"/>
+                <w:sz w:val="20"/>
+              </w:rPr>
+              <w:t xml:space="default">0.0000</w:t>
+            </w:r>
+          </w:p>
+        </w:tc>
+        <w:tc>
+          <w:tcPr>
+            <w:tcBorders>
+              <w:top w:val="single" w:space="0" w:color="D3D3D3"/>
+              <w:bottom w:val="single" w:space="0" w:color="D3D3D3"/>
+              <w:start w:val="single" w:space="0" w:color="D3D3D3"/>
+              <w:end w:val="single" w:space="0" w:color="D3D3D3"/>
+            </w:tcBorders>
+          </w:tcPr>
+          <w:p>
+            <w:pPr>
+              <w:spacing w:before="0" w:after="60"/>
+              <w:keepNext/>
+              <w:jc w:val="start"/>
+            </w:pPr>
+            <w:r>
+              <w:rPr>
+                <w:rFonts w:ascii="Calibri" w:hAnsi="Calibri"/>
+                <w:sz w:val="20"/>
+              </w:rPr>
+              <w:t xml:space="default">0.9932</w:t>
+            </w:r>
+          </w:p>
+        </w:tc>
+        <w:tc>
+          <w:tcPr>
+            <w:tcBorders>
+              <w:top w:val="single" w:space="0" w:color="D3D3D3"/>
+              <w:bottom w:val="single" w:space="0" w:color="D3D3D3"/>
+              <w:start w:val="single" w:space="0" w:color="D3D3D3"/>
+              <w:end w:val="single" w:space="0" w:color="D3D3D3"/>
+            </w:tcBorders>
+          </w:tcPr>
+          <w:p>
+            <w:pPr>
+              <w:spacing w:before="0" w:after="60"/>
+              <w:keepNext/>
+              <w:jc w:val="start"/>
+            </w:pPr>
+            <w:r>
+              <w:rPr>
+                <w:rFonts w:ascii="Calibri" w:hAnsi="Calibri"/>
+                <w:sz w:val="20"/>
+              </w:rPr>
+              <w:t xml:space="default">-46.3262</w:t>
             </w:r>
           </w:p>
         </w:tc>
@@ -401,103 +401,103 @@
                 <w:rFonts w:ascii="Calibri" w:hAnsi="Calibri"/>
                 <w:sz w:val="20"/>
               </w:rPr>
-              <w:t xml:space="default">8.000</w:t>
-            </w:r>
-          </w:p>
-        </w:tc>
-        <w:tc>
-          <w:tcPr>
-            <w:tcBorders>
-              <w:top w:val="single" w:space="0" w:color="D3D3D3"/>
-              <w:bottom w:val="single" w:space="0" w:color="D3D3D3"/>
-              <w:start w:val="single" w:space="0" w:color="D3D3D3"/>
-              <w:end w:val="single" w:space="0" w:color="D3D3D3"/>
-            </w:tcBorders>
-          </w:tcPr>
-          <w:p>
-            <w:pPr>
-              <w:spacing w:before="0" w:after="60"/>
-              <w:keepNext/>
-              <w:jc w:val="start"/>
-            </w:pPr>
-            <w:r>
-              <w:rPr>
-                <w:rFonts w:ascii="Calibri" w:hAnsi="Calibri"/>
-                <w:sz w:val="20"/>
-              </w:rPr>
-              <w:t xml:space="default">112.737</w:t>
-            </w:r>
-          </w:p>
-        </w:tc>
-        <w:tc>
-          <w:tcPr>
-            <w:tcBorders>
-              <w:top w:val="single" w:space="0" w:color="D3D3D3"/>
-              <w:bottom w:val="single" w:space="0" w:color="D3D3D3"/>
-              <w:start w:val="single" w:space="0" w:color="D3D3D3"/>
-              <w:end w:val="single" w:space="0" w:color="D3D3D3"/>
-            </w:tcBorders>
-          </w:tcPr>
-          <w:p>
-            <w:pPr>
-              <w:spacing w:before="0" w:after="60"/>
-              <w:keepNext/>
-              <w:jc w:val="start"/>
-            </w:pPr>
-            <w:r>
-              <w:rPr>
-                <w:rFonts w:ascii="Calibri" w:hAnsi="Calibri"/>
-                <w:sz w:val="20"/>
-              </w:rPr>
-              <w:t xml:space="default">9.979</w:t>
-            </w:r>
-          </w:p>
-        </w:tc>
-        <w:tc>
-          <w:tcPr>
-            <w:tcBorders>
-              <w:top w:val="single" w:space="0" w:color="D3D3D3"/>
-              <w:bottom w:val="single" w:space="0" w:color="D3D3D3"/>
-              <w:start w:val="single" w:space="0" w:color="D3D3D3"/>
-              <w:end w:val="single" w:space="0" w:color="D3D3D3"/>
-            </w:tcBorders>
-          </w:tcPr>
-          <w:p>
-            <w:pPr>
-              <w:spacing w:before="0" w:after="60"/>
-              <w:keepNext/>
-              <w:jc w:val="start"/>
-            </w:pPr>
-            <w:r>
-              <w:rPr>
-                <w:rFonts w:ascii="Calibri" w:hAnsi="Calibri"/>
-                <w:sz w:val="20"/>
-              </w:rPr>
-              <w:t xml:space="default">0.007</w:t>
-            </w:r>
-          </w:p>
-        </w:tc>
-        <w:tc>
-          <w:tcPr>
-            <w:tcBorders>
-              <w:top w:val="single" w:space="0" w:color="D3D3D3"/>
-              <w:bottom w:val="single" w:space="0" w:color="D3D3D3"/>
-              <w:start w:val="single" w:space="0" w:color="D3D3D3"/>
-              <w:end w:val="single" w:space="0" w:color="D3D3D3"/>
-            </w:tcBorders>
-          </w:tcPr>
-          <w:p>
-            <w:pPr>
-              <w:spacing w:before="0" w:after="60"/>
-              <w:keepNext/>
-              <w:jc w:val="start"/>
-            </w:pPr>
-            <w:r>
-              <w:rPr>
-                <w:rFonts w:ascii="Calibri" w:hAnsi="Calibri"/>
-                <w:sz w:val="20"/>
-              </w:rPr>
-              <w:t xml:space="default">-43.568</w:t>
+              <w:t xml:space="default">8.0000</w:t>
+            </w:r>
+          </w:p>
+        </w:tc>
+        <w:tc>
+          <w:tcPr>
+            <w:tcBorders>
+              <w:top w:val="single" w:space="0" w:color="D3D3D3"/>
+              <w:bottom w:val="single" w:space="0" w:color="D3D3D3"/>
+              <w:start w:val="single" w:space="0" w:color="D3D3D3"/>
+              <w:end w:val="single" w:space="0" w:color="D3D3D3"/>
+            </w:tcBorders>
+          </w:tcPr>
+          <w:p>
+            <w:pPr>
+              <w:spacing w:before="0" w:after="60"/>
+              <w:keepNext/>
+              <w:jc w:val="start"/>
+            </w:pPr>
+            <w:r>
+              <w:rPr>
+                <w:rFonts w:ascii="Calibri" w:hAnsi="Calibri"/>
+                <w:sz w:val="20"/>
+              </w:rPr>
+              <w:t xml:space="default">112.7367</w:t>
+            </w:r>
+          </w:p>
+        </w:tc>
+        <w:tc>
+          <w:tcPr>
+            <w:tcBorders>
+              <w:top w:val="single" w:space="0" w:color="D3D3D3"/>
+              <w:bottom w:val="single" w:space="0" w:color="D3D3D3"/>
+              <w:start w:val="single" w:space="0" w:color="D3D3D3"/>
+              <w:end w:val="single" w:space="0" w:color="D3D3D3"/>
+            </w:tcBorders>
+          </w:tcPr>
+          <w:p>
+            <w:pPr>
+              <w:spacing w:before="0" w:after="60"/>
+              <w:keepNext/>
+              <w:jc w:val="start"/>
+            </w:pPr>
+            <w:r>
+              <w:rPr>
+                <w:rFonts w:ascii="Calibri" w:hAnsi="Calibri"/>
+                <w:sz w:val="20"/>
+              </w:rPr>
+              <w:t xml:space="default">9.9789</w:t>
+            </w:r>
+          </w:p>
+        </w:tc>
+        <w:tc>
+          <w:tcPr>
+            <w:tcBorders>
+              <w:top w:val="single" w:space="0" w:color="D3D3D3"/>
+              <w:bottom w:val="single" w:space="0" w:color="D3D3D3"/>
+              <w:start w:val="single" w:space="0" w:color="D3D3D3"/>
+              <w:end w:val="single" w:space="0" w:color="D3D3D3"/>
+            </w:tcBorders>
+          </w:tcPr>
+          <w:p>
+            <w:pPr>
+              <w:spacing w:before="0" w:after="60"/>
+              <w:keepNext/>
+              <w:jc w:val="start"/>
+            </w:pPr>
+            <w:r>
+              <w:rPr>
+                <w:rFonts w:ascii="Calibri" w:hAnsi="Calibri"/>
+                <w:sz w:val="20"/>
+              </w:rPr>
+              <w:t xml:space="default">0.0068</w:t>
+            </w:r>
+          </w:p>
+        </w:tc>
+        <w:tc>
+          <w:tcPr>
+            <w:tcBorders>
+              <w:top w:val="single" w:space="0" w:color="D3D3D3"/>
+              <w:bottom w:val="single" w:space="0" w:color="D3D3D3"/>
+              <w:start w:val="single" w:space="0" w:color="D3D3D3"/>
+              <w:end w:val="single" w:space="0" w:color="D3D3D3"/>
+            </w:tcBorders>
+          </w:tcPr>
+          <w:p>
+            <w:pPr>
+              <w:spacing w:before="0" w:after="60"/>
+              <w:keepNext/>
+              <w:jc w:val="start"/>
+            </w:pPr>
+            <w:r>
+              <w:rPr>
+                <w:rFonts w:ascii="Calibri" w:hAnsi="Calibri"/>
+                <w:sz w:val="20"/>
+              </w:rPr>
+              <w:t xml:space="default">-43.5683</w:t>
             </w:r>
           </w:p>
         </w:tc>
@@ -555,7 +555,7 @@
           <w:sz w:val="24"/>
           <w:color w:val="333333"/>
         </w:rPr>
-        <w:t xml:space="default">ANOVA results, log-transformed per capita fecundity</w:t>
+        <w:t xml:space="default">ANOVA tables for fecundity assay (1. per-capita fecundity; 2. log-transformed per-capita fecundity)</w:t>
       </w:r>
     </w:p>
     <w:tbl xmlns:w="http://schemas.openxmlformats.org/wordprocessingml/2006/main" xmlns:wp="http://schemas.openxmlformats.org/drawingml/2006/wordprocessingDrawing" xmlns:r="http://schemas.openxmlformats.org/officeDocument/2006/relationships" xmlns:w14="http://schemas.microsoft.com/office/word/2010/wordml">
@@ -594,7 +594,7 @@
                 <w:rFonts w:ascii="Calibri" w:hAnsi="Calibri"/>
                 <w:sz w:val="20"/>
               </w:rPr>
-              <w:t xml:space="default">term</w:t>
+              <w:t xml:space="default">Model</w:t>
             </w:r>
           </w:p>
         </w:tc>
@@ -616,7 +616,7 @@
                 <w:rFonts w:ascii="Calibri" w:hAnsi="Calibri"/>
                 <w:sz w:val="20"/>
               </w:rPr>
-              <w:t xml:space="default">sumsq</w:t>
+              <w:t xml:space="default">term</w:t>
             </w:r>
           </w:p>
         </w:tc>
@@ -638,7 +638,7 @@
                 <w:rFonts w:ascii="Calibri" w:hAnsi="Calibri"/>
                 <w:sz w:val="20"/>
               </w:rPr>
-              <w:t xml:space="default">meansq</w:t>
+              <w:t xml:space="default">sumsq</w:t>
             </w:r>
           </w:p>
         </w:tc>
@@ -660,7 +660,7 @@
                 <w:rFonts w:ascii="Calibri" w:hAnsi="Calibri"/>
                 <w:sz w:val="20"/>
               </w:rPr>
-              <w:t xml:space="default">NumDF</w:t>
+              <w:t xml:space="default">meansq</w:t>
             </w:r>
           </w:p>
         </w:tc>
@@ -682,7 +682,7 @@
                 <w:rFonts w:ascii="Calibri" w:hAnsi="Calibri"/>
                 <w:sz w:val="20"/>
               </w:rPr>
-              <w:t xml:space="default">DenDF</w:t>
+              <w:t xml:space="default">NumDF</w:t>
             </w:r>
           </w:p>
         </w:tc>
@@ -704,7 +704,7 @@
                 <w:rFonts w:ascii="Calibri" w:hAnsi="Calibri"/>
                 <w:sz w:val="20"/>
               </w:rPr>
-              <w:t xml:space="default">statistic</w:t>
+              <w:t xml:space="default">DenDF</w:t>
             </w:r>
           </w:p>
         </w:tc>
@@ -713,7 +713,28 @@
             <w:tcBorders>
               <w:top w:val="single" w:sz="16" w:space="0" w:color="D3D3D3"/>
               <w:bottom w:val="single" w:sz="16" w:space="0" w:color="D3D3D3"/>
-              <w:end w:val="single" w:space="0" w:color="D3D3D3"/>
+            </w:tcBorders>
+          </w:tcPr>
+          <w:p>
+            <w:pPr>
+              <w:spacing w:before="0" w:after="60"/>
+              <w:keepNext/>
+              <w:jc w:val="start"/>
+            </w:pPr>
+            <w:r>
+              <w:rPr>
+                <w:rFonts w:ascii="Calibri" w:hAnsi="Calibri"/>
+                <w:sz w:val="20"/>
+              </w:rPr>
+              <w:t xml:space="default">statistic</w:t>
+            </w:r>
+          </w:p>
+        </w:tc>
+        <w:tc>
+          <w:tcPr>
+            <w:tcBorders>
+              <w:top w:val="single" w:sz="16" w:space="0" w:color="D3D3D3"/>
+              <w:bottom w:val="single" w:sz="16" w:space="0" w:color="D3D3D3"/>
             </w:tcBorders>
           </w:tcPr>
           <w:p>
@@ -728,6 +749,29 @@
                 <w:sz w:val="20"/>
               </w:rPr>
               <w:t xml:space="default">p.value</w:t>
+            </w:r>
+          </w:p>
+        </w:tc>
+        <w:tc>
+          <w:tcPr>
+            <w:tcBorders>
+              <w:top w:val="single" w:sz="16" w:space="0" w:color="D3D3D3"/>
+              <w:bottom w:val="single" w:sz="16" w:space="0" w:color="D3D3D3"/>
+              <w:end w:val="single" w:space="0" w:color="D3D3D3"/>
+            </w:tcBorders>
+          </w:tcPr>
+          <w:p>
+            <w:pPr>
+              <w:spacing w:before="0" w:after="60"/>
+              <w:keepNext/>
+              <w:jc w:val="start"/>
+            </w:pPr>
+            <w:r>
+              <w:rPr>
+                <w:rFonts w:ascii="Calibri" w:hAnsi="Calibri"/>
+                <w:sz w:val="20"/>
+              </w:rPr>
+              <w:t xml:space="default">adj_pval</w:t>
             </w:r>
           </w:p>
         </w:tc>
@@ -756,6 +800,30 @@
                 <w:rFonts w:ascii="Calibri" w:hAnsi="Calibri"/>
                 <w:sz w:val="20"/>
               </w:rPr>
+              <w:t xml:space="default">percapita_Fecundity</w:t>
+            </w:r>
+          </w:p>
+        </w:tc>
+        <w:tc>
+          <w:tcPr>
+            <w:tcBorders>
+              <w:top w:val="single" w:space="0" w:color="D3D3D3"/>
+              <w:bottom w:val="single" w:space="0" w:color="D3D3D3"/>
+              <w:start w:val="single" w:space="0" w:color="D3D3D3"/>
+              <w:end w:val="single" w:space="0" w:color="D3D3D3"/>
+            </w:tcBorders>
+          </w:tcPr>
+          <w:p>
+            <w:pPr>
+              <w:spacing w:before="0" w:after="60"/>
+              <w:keepNext/>
+              <w:jc w:val="start"/>
+            </w:pPr>
+            <w:r>
+              <w:rPr>
+                <w:rFonts w:ascii="Calibri" w:hAnsi="Calibri"/>
+                <w:sz w:val="20"/>
+              </w:rPr>
               <w:t xml:space="default">Selection</w:t>
             </w:r>
           </w:p>
@@ -780,127 +848,372 @@
                 <w:rFonts w:ascii="Calibri" w:hAnsi="Calibri"/>
                 <w:sz w:val="20"/>
               </w:rPr>
-              <w:t xml:space="default">10.314</w:t>
-            </w:r>
-          </w:p>
-        </w:tc>
-        <w:tc>
-          <w:tcPr>
-            <w:tcBorders>
-              <w:top w:val="single" w:space="0" w:color="D3D3D3"/>
-              <w:bottom w:val="single" w:space="0" w:color="D3D3D3"/>
-              <w:start w:val="single" w:space="0" w:color="D3D3D3"/>
-              <w:end w:val="single" w:space="0" w:color="D3D3D3"/>
-            </w:tcBorders>
-          </w:tcPr>
-          <w:p>
-            <w:pPr>
-              <w:spacing w:before="0" w:after="60"/>
-              <w:keepNext/>
-              <w:jc w:val="start"/>
-            </w:pPr>
-            <w:r>
-              <w:rPr>
-                <w:rFonts w:ascii="Calibri" w:hAnsi="Calibri"/>
-                <w:sz w:val="20"/>
-              </w:rPr>
-              <w:t xml:space="default">10.314</w:t>
-            </w:r>
-          </w:p>
-        </w:tc>
-        <w:tc>
-          <w:tcPr>
-            <w:tcBorders>
-              <w:top w:val="single" w:space="0" w:color="D3D3D3"/>
-              <w:bottom w:val="single" w:space="0" w:color="D3D3D3"/>
-              <w:start w:val="single" w:space="0" w:color="D3D3D3"/>
-              <w:end w:val="single" w:space="0" w:color="D3D3D3"/>
-            </w:tcBorders>
-          </w:tcPr>
-          <w:p>
-            <w:pPr>
-              <w:spacing w:before="0" w:after="60"/>
-              <w:keepNext/>
-              <w:jc w:val="start"/>
-            </w:pPr>
-            <w:r>
-              <w:rPr>
-                <w:rFonts w:ascii="Calibri" w:hAnsi="Calibri"/>
-                <w:sz w:val="20"/>
-              </w:rPr>
-              <w:t xml:space="default">1.000</w:t>
-            </w:r>
-          </w:p>
-        </w:tc>
-        <w:tc>
-          <w:tcPr>
-            <w:tcBorders>
-              <w:top w:val="single" w:space="0" w:color="D3D3D3"/>
-              <w:bottom w:val="single" w:space="0" w:color="D3D3D3"/>
-              <w:start w:val="single" w:space="0" w:color="D3D3D3"/>
-              <w:end w:val="single" w:space="0" w:color="D3D3D3"/>
-            </w:tcBorders>
-          </w:tcPr>
-          <w:p>
-            <w:pPr>
-              <w:spacing w:before="0" w:after="60"/>
-              <w:keepNext/>
-              <w:jc w:val="start"/>
-            </w:pPr>
-            <w:r>
-              <w:rPr>
-                <w:rFonts w:ascii="Calibri" w:hAnsi="Calibri"/>
-                <w:sz w:val="20"/>
-              </w:rPr>
-              <w:t xml:space="default">6.000</w:t>
-            </w:r>
-          </w:p>
-        </w:tc>
-        <w:tc>
-          <w:tcPr>
-            <w:tcBorders>
-              <w:top w:val="single" w:space="0" w:color="D3D3D3"/>
-              <w:bottom w:val="single" w:space="0" w:color="D3D3D3"/>
-              <w:start w:val="single" w:space="0" w:color="D3D3D3"/>
-              <w:end w:val="single" w:space="0" w:color="D3D3D3"/>
-            </w:tcBorders>
-          </w:tcPr>
-          <w:p>
-            <w:pPr>
-              <w:spacing w:before="0" w:after="60"/>
-              <w:keepNext/>
-              <w:jc w:val="start"/>
-            </w:pPr>
-            <w:r>
-              <w:rPr>
-                <w:rFonts w:ascii="Calibri" w:hAnsi="Calibri"/>
-                <w:sz w:val="20"/>
-              </w:rPr>
-              <w:t xml:space="default">4.811</w:t>
-            </w:r>
-          </w:p>
-        </w:tc>
-        <w:tc>
-          <w:tcPr>
-            <w:tcBorders>
-              <w:top w:val="single" w:space="0" w:color="D3D3D3"/>
-              <w:bottom w:val="single" w:space="0" w:color="D3D3D3"/>
-              <w:start w:val="single" w:space="0" w:color="D3D3D3"/>
-              <w:end w:val="single" w:space="0" w:color="D3D3D3"/>
-            </w:tcBorders>
-          </w:tcPr>
-          <w:p>
-            <w:pPr>
-              <w:spacing w:before="0" w:after="60"/>
-              <w:keepNext/>
-              <w:jc w:val="start"/>
-            </w:pPr>
-            <w:r>
-              <w:rPr>
-                <w:rFonts w:ascii="Calibri" w:hAnsi="Calibri"/>
-                <w:sz w:val="20"/>
-              </w:rPr>
-              <w:t xml:space="default">0.071</w:t>
+              <w:t xml:space="default">0.0152</w:t>
+            </w:r>
+          </w:p>
+        </w:tc>
+        <w:tc>
+          <w:tcPr>
+            <w:tcBorders>
+              <w:top w:val="single" w:space="0" w:color="D3D3D3"/>
+              <w:bottom w:val="single" w:space="0" w:color="D3D3D3"/>
+              <w:start w:val="single" w:space="0" w:color="D3D3D3"/>
+              <w:end w:val="single" w:space="0" w:color="D3D3D3"/>
+            </w:tcBorders>
+          </w:tcPr>
+          <w:p>
+            <w:pPr>
+              <w:spacing w:before="0" w:after="60"/>
+              <w:keepNext/>
+              <w:jc w:val="start"/>
+            </w:pPr>
+            <w:r>
+              <w:rPr>
+                <w:rFonts w:ascii="Calibri" w:hAnsi="Calibri"/>
+                <w:sz w:val="20"/>
+              </w:rPr>
+              <w:t xml:space="default">0.0152</w:t>
+            </w:r>
+          </w:p>
+        </w:tc>
+        <w:tc>
+          <w:tcPr>
+            <w:tcBorders>
+              <w:top w:val="single" w:space="0" w:color="D3D3D3"/>
+              <w:bottom w:val="single" w:space="0" w:color="D3D3D3"/>
+              <w:start w:val="single" w:space="0" w:color="D3D3D3"/>
+              <w:end w:val="single" w:space="0" w:color="D3D3D3"/>
+            </w:tcBorders>
+          </w:tcPr>
+          <w:p>
+            <w:pPr>
+              <w:spacing w:before="0" w:after="60"/>
+              <w:keepNext/>
+              <w:jc w:val="start"/>
+            </w:pPr>
+            <w:r>
+              <w:rPr>
+                <w:rFonts w:ascii="Calibri" w:hAnsi="Calibri"/>
+                <w:sz w:val="20"/>
+              </w:rPr>
+              <w:t xml:space="default">1.0000</w:t>
+            </w:r>
+          </w:p>
+        </w:tc>
+        <w:tc>
+          <w:tcPr>
+            <w:tcBorders>
+              <w:top w:val="single" w:space="0" w:color="D3D3D3"/>
+              <w:bottom w:val="single" w:space="0" w:color="D3D3D3"/>
+              <w:start w:val="single" w:space="0" w:color="D3D3D3"/>
+              <w:end w:val="single" w:space="0" w:color="D3D3D3"/>
+            </w:tcBorders>
+          </w:tcPr>
+          <w:p>
+            <w:pPr>
+              <w:spacing w:before="0" w:after="60"/>
+              <w:keepNext/>
+              <w:jc w:val="start"/>
+            </w:pPr>
+            <w:r>
+              <w:rPr>
+                <w:rFonts w:ascii="Calibri" w:hAnsi="Calibri"/>
+                <w:sz w:val="20"/>
+              </w:rPr>
+              <w:t xml:space="default">6.0000</w:t>
+            </w:r>
+          </w:p>
+        </w:tc>
+        <w:tc>
+          <w:tcPr>
+            <w:tcBorders>
+              <w:top w:val="single" w:space="0" w:color="D3D3D3"/>
+              <w:bottom w:val="single" w:space="0" w:color="D3D3D3"/>
+              <w:start w:val="single" w:space="0" w:color="D3D3D3"/>
+              <w:end w:val="single" w:space="0" w:color="D3D3D3"/>
+            </w:tcBorders>
+          </w:tcPr>
+          <w:p>
+            <w:pPr>
+              <w:spacing w:before="0" w:after="60"/>
+              <w:keepNext/>
+              <w:jc w:val="start"/>
+            </w:pPr>
+            <w:r>
+              <w:rPr>
+                <w:rFonts w:ascii="Calibri" w:hAnsi="Calibri"/>
+                <w:sz w:val="20"/>
+              </w:rPr>
+              <w:t xml:space="default">4.0144</w:t>
+            </w:r>
+          </w:p>
+        </w:tc>
+        <w:tc>
+          <w:tcPr>
+            <w:tcBorders>
+              <w:top w:val="single" w:space="0" w:color="D3D3D3"/>
+              <w:bottom w:val="single" w:space="0" w:color="D3D3D3"/>
+              <w:start w:val="single" w:space="0" w:color="D3D3D3"/>
+              <w:end w:val="single" w:space="0" w:color="D3D3D3"/>
+            </w:tcBorders>
+          </w:tcPr>
+          <w:p>
+            <w:pPr>
+              <w:spacing w:before="0" w:after="60"/>
+              <w:keepNext/>
+              <w:jc w:val="start"/>
+            </w:pPr>
+            <w:r>
+              <w:rPr>
+                <w:rFonts w:ascii="Calibri" w:hAnsi="Calibri"/>
+                <w:sz w:val="20"/>
+              </w:rPr>
+              <w:t xml:space="default">0.0920</w:t>
+            </w:r>
+          </w:p>
+        </w:tc>
+        <w:tc>
+          <w:tcPr>
+            <w:tcBorders>
+              <w:top w:val="single" w:space="0" w:color="D3D3D3"/>
+              <w:bottom w:val="single" w:space="0" w:color="D3D3D3"/>
+              <w:start w:val="single" w:space="0" w:color="D3D3D3"/>
+              <w:end w:val="single" w:space="0" w:color="D3D3D3"/>
+            </w:tcBorders>
+          </w:tcPr>
+          <w:p>
+            <w:pPr>
+              <w:spacing w:before="0" w:after="60"/>
+              <w:keepNext/>
+              <w:jc w:val="start"/>
+            </w:pPr>
+            <w:r>
+              <w:rPr>
+                <w:rFonts w:ascii="Calibri" w:hAnsi="Calibri"/>
+                <w:sz w:val="20"/>
+              </w:rPr>
+              <w:t xml:space="default">0.1480</w:t>
+            </w:r>
+          </w:p>
+        </w:tc>
+      </w:tr>
+      <w:tr>
+        <w:trPr>
+          <w:cantSplit/>
+        </w:trPr>
+        <w:tc>
+          <w:tcPr>
+            <w:tcBorders>
+              <w:top w:val="single" w:space="0" w:color="D3D3D3"/>
+              <w:bottom w:val="single" w:space="0" w:color="D3D3D3"/>
+              <w:start w:val="single" w:space="0" w:color="D3D3D3"/>
+              <w:end w:val="single" w:space="0" w:color="D3D3D3"/>
+            </w:tcBorders>
+          </w:tcPr>
+          <w:p>
+            <w:pPr>
+              <w:spacing w:before="0" w:after="60"/>
+              <w:keepNext/>
+              <w:jc w:val="start"/>
+            </w:pPr>
+            <w:r>
+              <w:rPr>
+                <w:rFonts w:ascii="Calibri" w:hAnsi="Calibri"/>
+                <w:sz w:val="20"/>
+              </w:rPr>
+              <w:t xml:space="default">log_percapita_Fecundity</w:t>
+            </w:r>
+          </w:p>
+        </w:tc>
+        <w:tc>
+          <w:tcPr>
+            <w:tcBorders>
+              <w:top w:val="single" w:space="0" w:color="D3D3D3"/>
+              <w:bottom w:val="single" w:space="0" w:color="D3D3D3"/>
+              <w:start w:val="single" w:space="0" w:color="D3D3D3"/>
+              <w:end w:val="single" w:space="0" w:color="D3D3D3"/>
+            </w:tcBorders>
+          </w:tcPr>
+          <w:p>
+            <w:pPr>
+              <w:spacing w:before="0" w:after="60"/>
+              <w:keepNext/>
+              <w:jc w:val="start"/>
+            </w:pPr>
+            <w:r>
+              <w:rPr>
+                <w:rFonts w:ascii="Calibri" w:hAnsi="Calibri"/>
+                <w:sz w:val="20"/>
+              </w:rPr>
+              <w:t xml:space="default">Selection</w:t>
+            </w:r>
+          </w:p>
+        </w:tc>
+        <w:tc>
+          <w:tcPr>
+            <w:tcBorders>
+              <w:top w:val="single" w:space="0" w:color="D3D3D3"/>
+              <w:bottom w:val="single" w:space="0" w:color="D3D3D3"/>
+              <w:start w:val="single" w:space="0" w:color="D3D3D3"/>
+              <w:end w:val="single" w:space="0" w:color="D3D3D3"/>
+            </w:tcBorders>
+          </w:tcPr>
+          <w:p>
+            <w:pPr>
+              <w:spacing w:before="0" w:after="60"/>
+              <w:keepNext/>
+              <w:jc w:val="start"/>
+            </w:pPr>
+            <w:r>
+              <w:rPr>
+                <w:rFonts w:ascii="Calibri" w:hAnsi="Calibri"/>
+                <w:sz w:val="20"/>
+              </w:rPr>
+              <w:t xml:space="default">10.3139</w:t>
+            </w:r>
+          </w:p>
+        </w:tc>
+        <w:tc>
+          <w:tcPr>
+            <w:tcBorders>
+              <w:top w:val="single" w:space="0" w:color="D3D3D3"/>
+              <w:bottom w:val="single" w:space="0" w:color="D3D3D3"/>
+              <w:start w:val="single" w:space="0" w:color="D3D3D3"/>
+              <w:end w:val="single" w:space="0" w:color="D3D3D3"/>
+            </w:tcBorders>
+          </w:tcPr>
+          <w:p>
+            <w:pPr>
+              <w:spacing w:before="0" w:after="60"/>
+              <w:keepNext/>
+              <w:jc w:val="start"/>
+            </w:pPr>
+            <w:r>
+              <w:rPr>
+                <w:rFonts w:ascii="Calibri" w:hAnsi="Calibri"/>
+                <w:sz w:val="20"/>
+              </w:rPr>
+              <w:t xml:space="default">10.3139</w:t>
+            </w:r>
+          </w:p>
+        </w:tc>
+        <w:tc>
+          <w:tcPr>
+            <w:tcBorders>
+              <w:top w:val="single" w:space="0" w:color="D3D3D3"/>
+              <w:bottom w:val="single" w:space="0" w:color="D3D3D3"/>
+              <w:start w:val="single" w:space="0" w:color="D3D3D3"/>
+              <w:end w:val="single" w:space="0" w:color="D3D3D3"/>
+            </w:tcBorders>
+          </w:tcPr>
+          <w:p>
+            <w:pPr>
+              <w:spacing w:before="0" w:after="60"/>
+              <w:keepNext/>
+              <w:jc w:val="start"/>
+            </w:pPr>
+            <w:r>
+              <w:rPr>
+                <w:rFonts w:ascii="Calibri" w:hAnsi="Calibri"/>
+                <w:sz w:val="20"/>
+              </w:rPr>
+              <w:t xml:space="default">1.0000</w:t>
+            </w:r>
+          </w:p>
+        </w:tc>
+        <w:tc>
+          <w:tcPr>
+            <w:tcBorders>
+              <w:top w:val="single" w:space="0" w:color="D3D3D3"/>
+              <w:bottom w:val="single" w:space="0" w:color="D3D3D3"/>
+              <w:start w:val="single" w:space="0" w:color="D3D3D3"/>
+              <w:end w:val="single" w:space="0" w:color="D3D3D3"/>
+            </w:tcBorders>
+          </w:tcPr>
+          <w:p>
+            <w:pPr>
+              <w:spacing w:before="0" w:after="60"/>
+              <w:keepNext/>
+              <w:jc w:val="start"/>
+            </w:pPr>
+            <w:r>
+              <w:rPr>
+                <w:rFonts w:ascii="Calibri" w:hAnsi="Calibri"/>
+                <w:sz w:val="20"/>
+              </w:rPr>
+              <w:t xml:space="default">6.0000</w:t>
+            </w:r>
+          </w:p>
+        </w:tc>
+        <w:tc>
+          <w:tcPr>
+            <w:tcBorders>
+              <w:top w:val="single" w:space="0" w:color="D3D3D3"/>
+              <w:bottom w:val="single" w:space="0" w:color="D3D3D3"/>
+              <w:start w:val="single" w:space="0" w:color="D3D3D3"/>
+              <w:end w:val="single" w:space="0" w:color="D3D3D3"/>
+            </w:tcBorders>
+          </w:tcPr>
+          <w:p>
+            <w:pPr>
+              <w:spacing w:before="0" w:after="60"/>
+              <w:keepNext/>
+              <w:jc w:val="start"/>
+            </w:pPr>
+            <w:r>
+              <w:rPr>
+                <w:rFonts w:ascii="Calibri" w:hAnsi="Calibri"/>
+                <w:sz w:val="20"/>
+              </w:rPr>
+              <w:t xml:space="default">4.8112</w:t>
+            </w:r>
+          </w:p>
+        </w:tc>
+        <w:tc>
+          <w:tcPr>
+            <w:tcBorders>
+              <w:top w:val="single" w:space="0" w:color="D3D3D3"/>
+              <w:bottom w:val="single" w:space="0" w:color="D3D3D3"/>
+              <w:start w:val="single" w:space="0" w:color="D3D3D3"/>
+              <w:end w:val="single" w:space="0" w:color="D3D3D3"/>
+            </w:tcBorders>
+          </w:tcPr>
+          <w:p>
+            <w:pPr>
+              <w:spacing w:before="0" w:after="60"/>
+              <w:keepNext/>
+              <w:jc w:val="start"/>
+            </w:pPr>
+            <w:r>
+              <w:rPr>
+                <w:rFonts w:ascii="Calibri" w:hAnsi="Calibri"/>
+                <w:sz w:val="20"/>
+              </w:rPr>
+              <w:t xml:space="default">0.0707</w:t>
+            </w:r>
+          </w:p>
+        </w:tc>
+        <w:tc>
+          <w:tcPr>
+            <w:tcBorders>
+              <w:top w:val="single" w:space="0" w:color="D3D3D3"/>
+              <w:bottom w:val="single" w:space="0" w:color="D3D3D3"/>
+              <w:start w:val="single" w:space="0" w:color="D3D3D3"/>
+              <w:end w:val="single" w:space="0" w:color="D3D3D3"/>
+            </w:tcBorders>
+          </w:tcPr>
+          <w:p>
+            <w:pPr>
+              <w:spacing w:before="0" w:after="60"/>
+              <w:keepNext/>
+              <w:jc w:val="start"/>
+            </w:pPr>
+            <w:r>
+              <w:rPr>
+                <w:rFonts w:ascii="Calibri" w:hAnsi="Calibri"/>
+                <w:sz w:val="20"/>
+              </w:rPr>
+              <w:t xml:space="default">0.1197</w:t>
             </w:r>
           </w:p>
         </w:tc>
@@ -958,7 +1271,7 @@
           <w:sz w:val="24"/>
           <w:color w:val="333333"/>
         </w:rPr>
-        <w:t xml:space="default">Partial Eta-squared value, log-transformed per capita fecundity</w:t>
+        <w:t xml:space="default">eta-squared table for fecundity assay (1. per-capita fecundity; 2. log-transformed per-capita fecundity)</w:t>
       </w:r>
     </w:p>
     <w:tbl xmlns:w="http://schemas.openxmlformats.org/wordprocessingml/2006/main" xmlns:wp="http://schemas.openxmlformats.org/drawingml/2006/wordprocessingDrawing" xmlns:r="http://schemas.openxmlformats.org/officeDocument/2006/relationships" xmlns:w14="http://schemas.microsoft.com/office/word/2010/wordml">
@@ -997,7 +1310,7 @@
                 <w:rFonts w:ascii="Calibri" w:hAnsi="Calibri"/>
                 <w:sz w:val="20"/>
               </w:rPr>
-              <w:t xml:space="default">Parameter</w:t>
+              <w:t xml:space="default">Model</w:t>
             </w:r>
           </w:p>
         </w:tc>
@@ -1019,7 +1332,7 @@
                 <w:rFonts w:ascii="Calibri" w:hAnsi="Calibri"/>
                 <w:sz w:val="20"/>
               </w:rPr>
-              <w:t xml:space="default">Eta2_partial</w:t>
+              <w:t xml:space="default">Parameter</w:t>
             </w:r>
           </w:p>
         </w:tc>
@@ -1041,7 +1354,7 @@
                 <w:rFonts w:ascii="Calibri" w:hAnsi="Calibri"/>
                 <w:sz w:val="20"/>
               </w:rPr>
-              <w:t xml:space="default">CI.x</w:t>
+              <w:t xml:space="default">Eta2_partial</w:t>
             </w:r>
           </w:p>
         </w:tc>
@@ -1063,7 +1376,7 @@
                 <w:rFonts w:ascii="Calibri" w:hAnsi="Calibri"/>
                 <w:sz w:val="20"/>
               </w:rPr>
-              <w:t xml:space="default">CI_low.x</w:t>
+              <w:t xml:space="default">CI</w:t>
             </w:r>
           </w:p>
         </w:tc>
@@ -1085,7 +1398,7 @@
                 <w:rFonts w:ascii="Calibri" w:hAnsi="Calibri"/>
                 <w:sz w:val="20"/>
               </w:rPr>
-              <w:t xml:space="default">CI_high.x</w:t>
+              <w:t xml:space="default">CI_low</w:t>
             </w:r>
           </w:p>
         </w:tc>
@@ -1094,87 +1407,21 @@
             <w:tcBorders>
               <w:top w:val="single" w:sz="16" w:space="0" w:color="D3D3D3"/>
               <w:bottom w:val="single" w:sz="16" w:space="0" w:color="D3D3D3"/>
-            </w:tcBorders>
-          </w:tcPr>
-          <w:p>
-            <w:pPr>
-              <w:spacing w:before="0" w:after="60"/>
-              <w:keepNext/>
-              <w:jc w:val="start"/>
-            </w:pPr>
-            <w:r>
-              <w:rPr>
-                <w:rFonts w:ascii="Calibri" w:hAnsi="Calibri"/>
-                <w:sz w:val="20"/>
-              </w:rPr>
-              <w:t xml:space="default">Cohens_f_partial</w:t>
-            </w:r>
-          </w:p>
-        </w:tc>
-        <w:tc>
-          <w:tcPr>
-            <w:tcBorders>
-              <w:top w:val="single" w:sz="16" w:space="0" w:color="D3D3D3"/>
-              <w:bottom w:val="single" w:sz="16" w:space="0" w:color="D3D3D3"/>
-            </w:tcBorders>
-          </w:tcPr>
-          <w:p>
-            <w:pPr>
-              <w:spacing w:before="0" w:after="60"/>
-              <w:keepNext/>
-              <w:jc w:val="start"/>
-            </w:pPr>
-            <w:r>
-              <w:rPr>
-                <w:rFonts w:ascii="Calibri" w:hAnsi="Calibri"/>
-                <w:sz w:val="20"/>
-              </w:rPr>
-              <w:t xml:space="default">CI.y</w:t>
-            </w:r>
-          </w:p>
-        </w:tc>
-        <w:tc>
-          <w:tcPr>
-            <w:tcBorders>
-              <w:top w:val="single" w:sz="16" w:space="0" w:color="D3D3D3"/>
-              <w:bottom w:val="single" w:sz="16" w:space="0" w:color="D3D3D3"/>
-            </w:tcBorders>
-          </w:tcPr>
-          <w:p>
-            <w:pPr>
-              <w:spacing w:before="0" w:after="60"/>
-              <w:keepNext/>
-              <w:jc w:val="start"/>
-            </w:pPr>
-            <w:r>
-              <w:rPr>
-                <w:rFonts w:ascii="Calibri" w:hAnsi="Calibri"/>
-                <w:sz w:val="20"/>
-              </w:rPr>
-              <w:t xml:space="default">CI_low.y</w:t>
-            </w:r>
-          </w:p>
-        </w:tc>
-        <w:tc>
-          <w:tcPr>
-            <w:tcBorders>
-              <w:top w:val="single" w:sz="16" w:space="0" w:color="D3D3D3"/>
-              <w:bottom w:val="single" w:sz="16" w:space="0" w:color="D3D3D3"/>
-              <w:end w:val="single" w:space="0" w:color="D3D3D3"/>
-            </w:tcBorders>
-          </w:tcPr>
-          <w:p>
-            <w:pPr>
-              <w:spacing w:before="0" w:after="60"/>
-              <w:keepNext/>
-              <w:jc w:val="start"/>
-            </w:pPr>
-            <w:r>
-              <w:rPr>
-                <w:rFonts w:ascii="Calibri" w:hAnsi="Calibri"/>
-                <w:sz w:val="20"/>
-              </w:rPr>
-              <w:t xml:space="default">CI_high.y</w:t>
+              <w:end w:val="single" w:space="0" w:color="D3D3D3"/>
+            </w:tcBorders>
+          </w:tcPr>
+          <w:p>
+            <w:pPr>
+              <w:spacing w:before="0" w:after="60"/>
+              <w:keepNext/>
+              <w:jc w:val="start"/>
+            </w:pPr>
+            <w:r>
+              <w:rPr>
+                <w:rFonts w:ascii="Calibri" w:hAnsi="Calibri"/>
+                <w:sz w:val="20"/>
+              </w:rPr>
+              <w:t xml:space="default">CI_high</w:t>
             </w:r>
           </w:p>
         </w:tc>
@@ -1203,6 +1450,30 @@
                 <w:rFonts w:ascii="Calibri" w:hAnsi="Calibri"/>
                 <w:sz w:val="20"/>
               </w:rPr>
+              <w:t xml:space="default">percapita_Fecundity</w:t>
+            </w:r>
+          </w:p>
+        </w:tc>
+        <w:tc>
+          <w:tcPr>
+            <w:tcBorders>
+              <w:top w:val="single" w:space="0" w:color="D3D3D3"/>
+              <w:bottom w:val="single" w:space="0" w:color="D3D3D3"/>
+              <w:start w:val="single" w:space="0" w:color="D3D3D3"/>
+              <w:end w:val="single" w:space="0" w:color="D3D3D3"/>
+            </w:tcBorders>
+          </w:tcPr>
+          <w:p>
+            <w:pPr>
+              <w:spacing w:before="0" w:after="60"/>
+              <w:keepNext/>
+              <w:jc w:val="start"/>
+            </w:pPr>
+            <w:r>
+              <w:rPr>
+                <w:rFonts w:ascii="Calibri" w:hAnsi="Calibri"/>
+                <w:sz w:val="20"/>
+              </w:rPr>
               <w:t xml:space="default">Selection</w:t>
             </w:r>
           </w:p>
@@ -1227,175 +1498,228 @@
                 <w:rFonts w:ascii="Calibri" w:hAnsi="Calibri"/>
                 <w:sz w:val="20"/>
               </w:rPr>
-              <w:t xml:space="default">0.445</w:t>
-            </w:r>
-          </w:p>
-        </w:tc>
-        <w:tc>
-          <w:tcPr>
-            <w:tcBorders>
-              <w:top w:val="single" w:space="0" w:color="D3D3D3"/>
-              <w:bottom w:val="single" w:space="0" w:color="D3D3D3"/>
-              <w:start w:val="single" w:space="0" w:color="D3D3D3"/>
-              <w:end w:val="single" w:space="0" w:color="D3D3D3"/>
-            </w:tcBorders>
-          </w:tcPr>
-          <w:p>
-            <w:pPr>
-              <w:spacing w:before="0" w:after="60"/>
-              <w:keepNext/>
-              <w:jc w:val="start"/>
-            </w:pPr>
-            <w:r>
-              <w:rPr>
-                <w:rFonts w:ascii="Calibri" w:hAnsi="Calibri"/>
-                <w:sz w:val="20"/>
-              </w:rPr>
-              <w:t xml:space="default">0.950</w:t>
-            </w:r>
-          </w:p>
-        </w:tc>
-        <w:tc>
-          <w:tcPr>
-            <w:tcBorders>
-              <w:top w:val="single" w:space="0" w:color="D3D3D3"/>
-              <w:bottom w:val="single" w:space="0" w:color="D3D3D3"/>
-              <w:start w:val="single" w:space="0" w:color="D3D3D3"/>
-              <w:end w:val="single" w:space="0" w:color="D3D3D3"/>
-            </w:tcBorders>
-          </w:tcPr>
-          <w:p>
-            <w:pPr>
-              <w:spacing w:before="0" w:after="60"/>
-              <w:keepNext/>
-              <w:jc w:val="start"/>
-            </w:pPr>
-            <w:r>
-              <w:rPr>
-                <w:rFonts w:ascii="Calibri" w:hAnsi="Calibri"/>
-                <w:sz w:val="20"/>
-              </w:rPr>
-              <w:t xml:space="default">0.000</w:t>
-            </w:r>
-          </w:p>
-        </w:tc>
-        <w:tc>
-          <w:tcPr>
-            <w:tcBorders>
-              <w:top w:val="single" w:space="0" w:color="D3D3D3"/>
-              <w:bottom w:val="single" w:space="0" w:color="D3D3D3"/>
-              <w:start w:val="single" w:space="0" w:color="D3D3D3"/>
-              <w:end w:val="single" w:space="0" w:color="D3D3D3"/>
-            </w:tcBorders>
-          </w:tcPr>
-          <w:p>
-            <w:pPr>
-              <w:spacing w:before="0" w:after="60"/>
-              <w:keepNext/>
-              <w:jc w:val="start"/>
-            </w:pPr>
-            <w:r>
-              <w:rPr>
-                <w:rFonts w:ascii="Calibri" w:hAnsi="Calibri"/>
-                <w:sz w:val="20"/>
-              </w:rPr>
-              <w:t xml:space="default">1.000</w:t>
-            </w:r>
-          </w:p>
-        </w:tc>
-        <w:tc>
-          <w:tcPr>
-            <w:tcBorders>
-              <w:top w:val="single" w:space="0" w:color="D3D3D3"/>
-              <w:bottom w:val="single" w:space="0" w:color="D3D3D3"/>
-              <w:start w:val="single" w:space="0" w:color="D3D3D3"/>
-              <w:end w:val="single" w:space="0" w:color="D3D3D3"/>
-            </w:tcBorders>
-          </w:tcPr>
-          <w:p>
-            <w:pPr>
-              <w:spacing w:before="0" w:after="60"/>
-              <w:keepNext/>
-              <w:jc w:val="start"/>
-            </w:pPr>
-            <w:r>
-              <w:rPr>
-                <w:rFonts w:ascii="Calibri" w:hAnsi="Calibri"/>
-                <w:sz w:val="20"/>
-              </w:rPr>
-              <w:t xml:space="default">0.895</w:t>
-            </w:r>
-          </w:p>
-        </w:tc>
-        <w:tc>
-          <w:tcPr>
-            <w:tcBorders>
-              <w:top w:val="single" w:space="0" w:color="D3D3D3"/>
-              <w:bottom w:val="single" w:space="0" w:color="D3D3D3"/>
-              <w:start w:val="single" w:space="0" w:color="D3D3D3"/>
-              <w:end w:val="single" w:space="0" w:color="D3D3D3"/>
-            </w:tcBorders>
-          </w:tcPr>
-          <w:p>
-            <w:pPr>
-              <w:spacing w:before="0" w:after="60"/>
-              <w:keepNext/>
-              <w:jc w:val="start"/>
-            </w:pPr>
-            <w:r>
-              <w:rPr>
-                <w:rFonts w:ascii="Calibri" w:hAnsi="Calibri"/>
-                <w:sz w:val="20"/>
-              </w:rPr>
-              <w:t xml:space="default">0.950</w:t>
-            </w:r>
-          </w:p>
-        </w:tc>
-        <w:tc>
-          <w:tcPr>
-            <w:tcBorders>
-              <w:top w:val="single" w:space="0" w:color="D3D3D3"/>
-              <w:bottom w:val="single" w:space="0" w:color="D3D3D3"/>
-              <w:start w:val="single" w:space="0" w:color="D3D3D3"/>
-              <w:end w:val="single" w:space="0" w:color="D3D3D3"/>
-            </w:tcBorders>
-          </w:tcPr>
-          <w:p>
-            <w:pPr>
-              <w:spacing w:before="0" w:after="60"/>
-              <w:keepNext/>
-              <w:jc w:val="start"/>
-            </w:pPr>
-            <w:r>
-              <w:rPr>
-                <w:rFonts w:ascii="Calibri" w:hAnsi="Calibri"/>
-                <w:sz w:val="20"/>
-              </w:rPr>
-              <w:t xml:space="default">0.000</w:t>
-            </w:r>
-          </w:p>
-        </w:tc>
-        <w:tc>
-          <w:tcPr>
-            <w:tcBorders>
-              <w:top w:val="single" w:space="0" w:color="D3D3D3"/>
-              <w:bottom w:val="single" w:space="0" w:color="D3D3D3"/>
-              <w:start w:val="single" w:space="0" w:color="D3D3D3"/>
-              <w:end w:val="single" w:space="0" w:color="D3D3D3"/>
-            </w:tcBorders>
-          </w:tcPr>
-          <w:p>
-            <w:pPr>
-              <w:spacing w:before="0" w:after="60"/>
-              <w:keepNext/>
-              <w:jc w:val="start"/>
-            </w:pPr>
-            <w:r>
-              <w:rPr>
-                <w:rFonts w:ascii="Calibri" w:hAnsi="Calibri"/>
-                <w:sz w:val="20"/>
-              </w:rPr>
-              <w:t xml:space="default"/>
+              <w:t xml:space="default">0.4009</w:t>
+            </w:r>
+          </w:p>
+        </w:tc>
+        <w:tc>
+          <w:tcPr>
+            <w:tcBorders>
+              <w:top w:val="single" w:space="0" w:color="D3D3D3"/>
+              <w:bottom w:val="single" w:space="0" w:color="D3D3D3"/>
+              <w:start w:val="single" w:space="0" w:color="D3D3D3"/>
+              <w:end w:val="single" w:space="0" w:color="D3D3D3"/>
+            </w:tcBorders>
+          </w:tcPr>
+          <w:p>
+            <w:pPr>
+              <w:spacing w:before="0" w:after="60"/>
+              <w:keepNext/>
+              <w:jc w:val="start"/>
+            </w:pPr>
+            <w:r>
+              <w:rPr>
+                <w:rFonts w:ascii="Calibri" w:hAnsi="Calibri"/>
+                <w:sz w:val="20"/>
+              </w:rPr>
+              <w:t xml:space="default">0.9500</w:t>
+            </w:r>
+          </w:p>
+        </w:tc>
+        <w:tc>
+          <w:tcPr>
+            <w:tcBorders>
+              <w:top w:val="single" w:space="0" w:color="D3D3D3"/>
+              <w:bottom w:val="single" w:space="0" w:color="D3D3D3"/>
+              <w:start w:val="single" w:space="0" w:color="D3D3D3"/>
+              <w:end w:val="single" w:space="0" w:color="D3D3D3"/>
+            </w:tcBorders>
+          </w:tcPr>
+          <w:p>
+            <w:pPr>
+              <w:spacing w:before="0" w:after="60"/>
+              <w:keepNext/>
+              <w:jc w:val="start"/>
+            </w:pPr>
+            <w:r>
+              <w:rPr>
+                <w:rFonts w:ascii="Calibri" w:hAnsi="Calibri"/>
+                <w:sz w:val="20"/>
+              </w:rPr>
+              <w:t xml:space="default">0.0000</w:t>
+            </w:r>
+          </w:p>
+        </w:tc>
+        <w:tc>
+          <w:tcPr>
+            <w:tcBorders>
+              <w:top w:val="single" w:space="0" w:color="D3D3D3"/>
+              <w:bottom w:val="single" w:space="0" w:color="D3D3D3"/>
+              <w:start w:val="single" w:space="0" w:color="D3D3D3"/>
+              <w:end w:val="single" w:space="0" w:color="D3D3D3"/>
+            </w:tcBorders>
+          </w:tcPr>
+          <w:p>
+            <w:pPr>
+              <w:spacing w:before="0" w:after="60"/>
+              <w:keepNext/>
+              <w:jc w:val="start"/>
+            </w:pPr>
+            <w:r>
+              <w:rPr>
+                <w:rFonts w:ascii="Calibri" w:hAnsi="Calibri"/>
+                <w:sz w:val="20"/>
+              </w:rPr>
+              <w:t xml:space="default">1.0000</w:t>
+            </w:r>
+          </w:p>
+        </w:tc>
+      </w:tr>
+      <w:tr>
+        <w:trPr>
+          <w:cantSplit/>
+        </w:trPr>
+        <w:tc>
+          <w:tcPr>
+            <w:tcBorders>
+              <w:top w:val="single" w:space="0" w:color="D3D3D3"/>
+              <w:bottom w:val="single" w:space="0" w:color="D3D3D3"/>
+              <w:start w:val="single" w:space="0" w:color="D3D3D3"/>
+              <w:end w:val="single" w:space="0" w:color="D3D3D3"/>
+            </w:tcBorders>
+          </w:tcPr>
+          <w:p>
+            <w:pPr>
+              <w:spacing w:before="0" w:after="60"/>
+              <w:keepNext/>
+              <w:jc w:val="start"/>
+            </w:pPr>
+            <w:r>
+              <w:rPr>
+                <w:rFonts w:ascii="Calibri" w:hAnsi="Calibri"/>
+                <w:sz w:val="20"/>
+              </w:rPr>
+              <w:t xml:space="default">log_percapita_Fecundity</w:t>
+            </w:r>
+          </w:p>
+        </w:tc>
+        <w:tc>
+          <w:tcPr>
+            <w:tcBorders>
+              <w:top w:val="single" w:space="0" w:color="D3D3D3"/>
+              <w:bottom w:val="single" w:space="0" w:color="D3D3D3"/>
+              <w:start w:val="single" w:space="0" w:color="D3D3D3"/>
+              <w:end w:val="single" w:space="0" w:color="D3D3D3"/>
+            </w:tcBorders>
+          </w:tcPr>
+          <w:p>
+            <w:pPr>
+              <w:spacing w:before="0" w:after="60"/>
+              <w:keepNext/>
+              <w:jc w:val="start"/>
+            </w:pPr>
+            <w:r>
+              <w:rPr>
+                <w:rFonts w:ascii="Calibri" w:hAnsi="Calibri"/>
+                <w:sz w:val="20"/>
+              </w:rPr>
+              <w:t xml:space="default">Selection</w:t>
+            </w:r>
+          </w:p>
+        </w:tc>
+        <w:tc>
+          <w:tcPr>
+            <w:tcBorders>
+              <w:top w:val="single" w:space="0" w:color="D3D3D3"/>
+              <w:bottom w:val="single" w:space="0" w:color="D3D3D3"/>
+              <w:start w:val="single" w:space="0" w:color="D3D3D3"/>
+              <w:end w:val="single" w:space="0" w:color="D3D3D3"/>
+            </w:tcBorders>
+          </w:tcPr>
+          <w:p>
+            <w:pPr>
+              <w:spacing w:before="0" w:after="60"/>
+              <w:keepNext/>
+              <w:jc w:val="start"/>
+            </w:pPr>
+            <w:r>
+              <w:rPr>
+                <w:rFonts w:ascii="Calibri" w:hAnsi="Calibri"/>
+                <w:sz w:val="20"/>
+              </w:rPr>
+              <w:t xml:space="default">0.4450</w:t>
+            </w:r>
+          </w:p>
+        </w:tc>
+        <w:tc>
+          <w:tcPr>
+            <w:tcBorders>
+              <w:top w:val="single" w:space="0" w:color="D3D3D3"/>
+              <w:bottom w:val="single" w:space="0" w:color="D3D3D3"/>
+              <w:start w:val="single" w:space="0" w:color="D3D3D3"/>
+              <w:end w:val="single" w:space="0" w:color="D3D3D3"/>
+            </w:tcBorders>
+          </w:tcPr>
+          <w:p>
+            <w:pPr>
+              <w:spacing w:before="0" w:after="60"/>
+              <w:keepNext/>
+              <w:jc w:val="start"/>
+            </w:pPr>
+            <w:r>
+              <w:rPr>
+                <w:rFonts w:ascii="Calibri" w:hAnsi="Calibri"/>
+                <w:sz w:val="20"/>
+              </w:rPr>
+              <w:t xml:space="default">0.9500</w:t>
+            </w:r>
+          </w:p>
+        </w:tc>
+        <w:tc>
+          <w:tcPr>
+            <w:tcBorders>
+              <w:top w:val="single" w:space="0" w:color="D3D3D3"/>
+              <w:bottom w:val="single" w:space="0" w:color="D3D3D3"/>
+              <w:start w:val="single" w:space="0" w:color="D3D3D3"/>
+              <w:end w:val="single" w:space="0" w:color="D3D3D3"/>
+            </w:tcBorders>
+          </w:tcPr>
+          <w:p>
+            <w:pPr>
+              <w:spacing w:before="0" w:after="60"/>
+              <w:keepNext/>
+              <w:jc w:val="start"/>
+            </w:pPr>
+            <w:r>
+              <w:rPr>
+                <w:rFonts w:ascii="Calibri" w:hAnsi="Calibri"/>
+                <w:sz w:val="20"/>
+              </w:rPr>
+              <w:t xml:space="default">0.0000</w:t>
+            </w:r>
+          </w:p>
+        </w:tc>
+        <w:tc>
+          <w:tcPr>
+            <w:tcBorders>
+              <w:top w:val="single" w:space="0" w:color="D3D3D3"/>
+              <w:bottom w:val="single" w:space="0" w:color="D3D3D3"/>
+              <w:start w:val="single" w:space="0" w:color="D3D3D3"/>
+              <w:end w:val="single" w:space="0" w:color="D3D3D3"/>
+            </w:tcBorders>
+          </w:tcPr>
+          <w:p>
+            <w:pPr>
+              <w:spacing w:before="0" w:after="60"/>
+              <w:keepNext/>
+              <w:jc w:val="start"/>
+            </w:pPr>
+            <w:r>
+              <w:rPr>
+                <w:rFonts w:ascii="Calibri" w:hAnsi="Calibri"/>
+                <w:sz w:val="20"/>
+              </w:rPr>
+              <w:t xml:space="default">1.0000</w:t>
             </w:r>
           </w:p>
         </w:tc>
@@ -1453,7 +1777,7 @@
           <w:sz w:val="24"/>
           <w:color w:val="333333"/>
         </w:rPr>
-        <w:t xml:space="default">ANOVA results, per capita fecundity</w:t>
+        <w:t xml:space="default">correlation tables for fecundity assay for number of females vs. fecundity</w:t>
       </w:r>
     </w:p>
     <w:tbl xmlns:w="http://schemas.openxmlformats.org/wordprocessingml/2006/main" xmlns:wp="http://schemas.openxmlformats.org/drawingml/2006/wordprocessingDrawing" xmlns:r="http://schemas.openxmlformats.org/officeDocument/2006/relationships" xmlns:w14="http://schemas.microsoft.com/office/word/2010/wordml">
@@ -1492,7 +1816,7 @@
                 <w:rFonts w:ascii="Calibri" w:hAnsi="Calibri"/>
                 <w:sz w:val="20"/>
               </w:rPr>
-              <w:t xml:space="default">term</w:t>
+              <w:t xml:space="default">Selection</w:t>
             </w:r>
           </w:p>
         </w:tc>
@@ -1514,7 +1838,7 @@
                 <w:rFonts w:ascii="Calibri" w:hAnsi="Calibri"/>
                 <w:sz w:val="20"/>
               </w:rPr>
-              <w:t xml:space="default">sumsq</w:t>
+              <w:t xml:space="default">estimate</w:t>
             </w:r>
           </w:p>
         </w:tc>
@@ -1536,7 +1860,7 @@
                 <w:rFonts w:ascii="Calibri" w:hAnsi="Calibri"/>
                 <w:sz w:val="20"/>
               </w:rPr>
-              <w:t xml:space="default">meansq</w:t>
+              <w:t xml:space="default">statistic</w:t>
             </w:r>
           </w:p>
         </w:tc>
@@ -1558,7 +1882,7 @@
                 <w:rFonts w:ascii="Calibri" w:hAnsi="Calibri"/>
                 <w:sz w:val="20"/>
               </w:rPr>
-              <w:t xml:space="default">NumDF</w:t>
+              <w:t xml:space="default">p.value</w:t>
             </w:r>
           </w:p>
         </w:tc>
@@ -1580,7 +1904,7 @@
                 <w:rFonts w:ascii="Calibri" w:hAnsi="Calibri"/>
                 <w:sz w:val="20"/>
               </w:rPr>
-              <w:t xml:space="default">DenDF</w:t>
+              <w:t xml:space="default">parameter</w:t>
             </w:r>
           </w:p>
         </w:tc>
@@ -1602,7 +1926,7 @@
                 <w:rFonts w:ascii="Calibri" w:hAnsi="Calibri"/>
                 <w:sz w:val="20"/>
               </w:rPr>
-              <w:t xml:space="default">statistic</w:t>
+              <w:t xml:space="default">conf.low</w:t>
             </w:r>
           </w:p>
         </w:tc>
@@ -1611,21 +1935,65 @@
             <w:tcBorders>
               <w:top w:val="single" w:sz="16" w:space="0" w:color="D3D3D3"/>
               <w:bottom w:val="single" w:sz="16" w:space="0" w:color="D3D3D3"/>
-              <w:end w:val="single" w:space="0" w:color="D3D3D3"/>
-            </w:tcBorders>
-          </w:tcPr>
-          <w:p>
-            <w:pPr>
-              <w:spacing w:before="0" w:after="60"/>
-              <w:keepNext/>
-              <w:jc w:val="start"/>
-            </w:pPr>
-            <w:r>
-              <w:rPr>
-                <w:rFonts w:ascii="Calibri" w:hAnsi="Calibri"/>
-                <w:sz w:val="20"/>
-              </w:rPr>
-              <w:t xml:space="default">p.value</w:t>
+            </w:tcBorders>
+          </w:tcPr>
+          <w:p>
+            <w:pPr>
+              <w:spacing w:before="0" w:after="60"/>
+              <w:keepNext/>
+              <w:jc w:val="start"/>
+            </w:pPr>
+            <w:r>
+              <w:rPr>
+                <w:rFonts w:ascii="Calibri" w:hAnsi="Calibri"/>
+                <w:sz w:val="20"/>
+              </w:rPr>
+              <w:t xml:space="default">conf.high</w:t>
+            </w:r>
+          </w:p>
+        </w:tc>
+        <w:tc>
+          <w:tcPr>
+            <w:tcBorders>
+              <w:top w:val="single" w:sz="16" w:space="0" w:color="D3D3D3"/>
+              <w:bottom w:val="single" w:sz="16" w:space="0" w:color="D3D3D3"/>
+            </w:tcBorders>
+          </w:tcPr>
+          <w:p>
+            <w:pPr>
+              <w:spacing w:before="0" w:after="60"/>
+              <w:keepNext/>
+              <w:jc w:val="start"/>
+            </w:pPr>
+            <w:r>
+              <w:rPr>
+                <w:rFonts w:ascii="Calibri" w:hAnsi="Calibri"/>
+                <w:sz w:val="20"/>
+              </w:rPr>
+              <w:t xml:space="default">method</w:t>
+            </w:r>
+          </w:p>
+        </w:tc>
+        <w:tc>
+          <w:tcPr>
+            <w:tcBorders>
+              <w:top w:val="single" w:sz="16" w:space="0" w:color="D3D3D3"/>
+              <w:bottom w:val="single" w:sz="16" w:space="0" w:color="D3D3D3"/>
+              <w:end w:val="single" w:space="0" w:color="D3D3D3"/>
+            </w:tcBorders>
+          </w:tcPr>
+          <w:p>
+            <w:pPr>
+              <w:spacing w:before="0" w:after="60"/>
+              <w:keepNext/>
+              <w:jc w:val="start"/>
+            </w:pPr>
+            <w:r>
+              <w:rPr>
+                <w:rFonts w:ascii="Calibri" w:hAnsi="Calibri"/>
+                <w:sz w:val="20"/>
+              </w:rPr>
+              <w:t xml:space="default">alternative</w:t>
             </w:r>
           </w:p>
         </w:tc>
@@ -1654,403 +2022,199 @@
                 <w:rFonts w:ascii="Calibri" w:hAnsi="Calibri"/>
                 <w:sz w:val="20"/>
               </w:rPr>
-              <w:t xml:space="default">Selection</w:t>
-            </w:r>
-          </w:p>
-        </w:tc>
-        <w:tc>
-          <w:tcPr>
-            <w:tcBorders>
-              <w:top w:val="single" w:space="0" w:color="D3D3D3"/>
-              <w:bottom w:val="single" w:space="0" w:color="D3D3D3"/>
-              <w:start w:val="single" w:space="0" w:color="D3D3D3"/>
-              <w:end w:val="single" w:space="0" w:color="D3D3D3"/>
-            </w:tcBorders>
-          </w:tcPr>
-          <w:p>
-            <w:pPr>
-              <w:spacing w:before="0" w:after="60"/>
-              <w:keepNext/>
-              <w:jc w:val="start"/>
-            </w:pPr>
-            <w:r>
-              <w:rPr>
-                <w:rFonts w:ascii="Calibri" w:hAnsi="Calibri"/>
-                <w:sz w:val="20"/>
-              </w:rPr>
-              <w:t xml:space="default">0.015</w:t>
-            </w:r>
-          </w:p>
-        </w:tc>
-        <w:tc>
-          <w:tcPr>
-            <w:tcBorders>
-              <w:top w:val="single" w:space="0" w:color="D3D3D3"/>
-              <w:bottom w:val="single" w:space="0" w:color="D3D3D3"/>
-              <w:start w:val="single" w:space="0" w:color="D3D3D3"/>
-              <w:end w:val="single" w:space="0" w:color="D3D3D3"/>
-            </w:tcBorders>
-          </w:tcPr>
-          <w:p>
-            <w:pPr>
-              <w:spacing w:before="0" w:after="60"/>
-              <w:keepNext/>
-              <w:jc w:val="start"/>
-            </w:pPr>
-            <w:r>
-              <w:rPr>
-                <w:rFonts w:ascii="Calibri" w:hAnsi="Calibri"/>
-                <w:sz w:val="20"/>
-              </w:rPr>
-              <w:t xml:space="default">0.015</w:t>
-            </w:r>
-          </w:p>
-        </w:tc>
-        <w:tc>
-          <w:tcPr>
-            <w:tcBorders>
-              <w:top w:val="single" w:space="0" w:color="D3D3D3"/>
-              <w:bottom w:val="single" w:space="0" w:color="D3D3D3"/>
-              <w:start w:val="single" w:space="0" w:color="D3D3D3"/>
-              <w:end w:val="single" w:space="0" w:color="D3D3D3"/>
-            </w:tcBorders>
-          </w:tcPr>
-          <w:p>
-            <w:pPr>
-              <w:spacing w:before="0" w:after="60"/>
-              <w:keepNext/>
-              <w:jc w:val="start"/>
-            </w:pPr>
-            <w:r>
-              <w:rPr>
-                <w:rFonts w:ascii="Calibri" w:hAnsi="Calibri"/>
-                <w:sz w:val="20"/>
-              </w:rPr>
-              <w:t xml:space="default">1.000</w:t>
-            </w:r>
-          </w:p>
-        </w:tc>
-        <w:tc>
-          <w:tcPr>
-            <w:tcBorders>
-              <w:top w:val="single" w:space="0" w:color="D3D3D3"/>
-              <w:bottom w:val="single" w:space="0" w:color="D3D3D3"/>
-              <w:start w:val="single" w:space="0" w:color="D3D3D3"/>
-              <w:end w:val="single" w:space="0" w:color="D3D3D3"/>
-            </w:tcBorders>
-          </w:tcPr>
-          <w:p>
-            <w:pPr>
-              <w:spacing w:before="0" w:after="60"/>
-              <w:keepNext/>
-              <w:jc w:val="start"/>
-            </w:pPr>
-            <w:r>
-              <w:rPr>
-                <w:rFonts w:ascii="Calibri" w:hAnsi="Calibri"/>
-                <w:sz w:val="20"/>
-              </w:rPr>
-              <w:t xml:space="default">6.000</w:t>
-            </w:r>
-          </w:p>
-        </w:tc>
-        <w:tc>
-          <w:tcPr>
-            <w:tcBorders>
-              <w:top w:val="single" w:space="0" w:color="D3D3D3"/>
-              <w:bottom w:val="single" w:space="0" w:color="D3D3D3"/>
-              <w:start w:val="single" w:space="0" w:color="D3D3D3"/>
-              <w:end w:val="single" w:space="0" w:color="D3D3D3"/>
-            </w:tcBorders>
-          </w:tcPr>
-          <w:p>
-            <w:pPr>
-              <w:spacing w:before="0" w:after="60"/>
-              <w:keepNext/>
-              <w:jc w:val="start"/>
-            </w:pPr>
-            <w:r>
-              <w:rPr>
-                <w:rFonts w:ascii="Calibri" w:hAnsi="Calibri"/>
-                <w:sz w:val="20"/>
-              </w:rPr>
-              <w:t xml:space="default">4.014</w:t>
-            </w:r>
-          </w:p>
-        </w:tc>
-        <w:tc>
-          <w:tcPr>
-            <w:tcBorders>
-              <w:top w:val="single" w:space="0" w:color="D3D3D3"/>
-              <w:bottom w:val="single" w:space="0" w:color="D3D3D3"/>
-              <w:start w:val="single" w:space="0" w:color="D3D3D3"/>
-              <w:end w:val="single" w:space="0" w:color="D3D3D3"/>
-            </w:tcBorders>
-          </w:tcPr>
-          <w:p>
-            <w:pPr>
-              <w:spacing w:before="0" w:after="60"/>
-              <w:keepNext/>
-              <w:jc w:val="start"/>
-            </w:pPr>
-            <w:r>
-              <w:rPr>
-                <w:rFonts w:ascii="Calibri" w:hAnsi="Calibri"/>
-                <w:sz w:val="20"/>
-              </w:rPr>
-              <w:t xml:space="default">0.092</w:t>
-            </w:r>
-          </w:p>
-        </w:tc>
-      </w:tr>
-    </w:tbl>
-    <w:p>
-      <w:r>
-        <w:br w:type="page"/>
-      </w:r>
-    </w:p>
-    <w:p>
-      <w:pPr>
-        <w:spacing w:before="0" w:after="60"/>
-        <w:keepNext/>
-        <w:jc w:val="start"/>
-        <w:pStyle w:val="caption"/>
-      </w:pPr>
-      <w:r>
-        <w:rPr>
-          <w:rFonts w:ascii="Calibri" w:hAnsi="Calibri"/>
-          <w:sz w:val="24"/>
-        </w:rPr>
-        <w:t xml:space="preserve">Table </w:t>
-      </w:r>
-      <w:r>
-        <w:fldChar w:fldCharType="begin" w:dirty="true"/>
-      </w:r>
-      <w:r>
-        <w:instrText xml:space="preserve" w:dirty="true"> SEQ Table \* ARABIC </w:instrText>
-      </w:r>
-      <w:r>
-        <w:fldChar w:fldCharType="separate" w:dirty="true"/>
-      </w:r>
-      <w:r>
-        <w:rPr>
-          <w:noProof/>
-          <w:rFonts w:ascii="Calibri" w:hAnsi="Calibri"/>
-          <w:sz w:val="24"/>
-        </w:rPr>
-        <w:t xml:space="default">1</w:t>
-      </w:r>
-      <w:r>
-        <w:fldChar w:fldCharType="end" w:dirty="true"/>
-      </w:r>
-      <w:r>
-        <w:rPr>
-          <w:rFonts w:ascii="Calibri" w:hAnsi="Calibri"/>
-          <w:sz w:val="24"/>
-        </w:rPr>
-        <w:t xml:space="preserve">: </w:t>
-      </w:r>
-      <w:r>
-        <w:rPr>
-          <w:rFonts w:ascii="Calibri" w:hAnsi="Calibri"/>
-          <w:sz w:val="24"/>
-          <w:color w:val="333333"/>
-        </w:rPr>
-        <w:t xml:space="default">Correlation of female population size and total fecundity: CON</w:t>
-      </w:r>
-    </w:p>
-    <w:tbl xmlns:w="http://schemas.openxmlformats.org/wordprocessingml/2006/main" xmlns:wp="http://schemas.openxmlformats.org/drawingml/2006/wordprocessingDrawing" xmlns:r="http://schemas.openxmlformats.org/officeDocument/2006/relationships" xmlns:w14="http://schemas.microsoft.com/office/word/2010/wordml">
-      <w:tblPr>
-        <w:tblCellMar>
-          <w:top w:w="0" w:type="dxa"/>
-          <w:bottom w:w="0" w:type="dxa"/>
-          <w:start w:w="60" w:type="dxa"/>
-          <w:end w:w="60" w:type="dxa"/>
-        </w:tblCellMar>
-        <w:tblW w:type="auto" w:w="0"/>
-        <w:tblLook w:firstRow="0" w:lastRow="0" w:firstColumn="0" w:lastColumn="0" w:noHBand="0" w:noVBand="0"/>
-        <w:jc w:val="center"/>
-      </w:tblPr>
-      <w:tr>
-        <w:trPr>
-          <w:cantSplit/>
-          <w:tblHeader/>
-        </w:trPr>
-        <w:tc>
-          <w:tcPr>
-            <w:tcBorders>
-              <w:top w:val="single" w:sz="16" w:space="0" w:color="D3D3D3"/>
-              <w:bottom w:val="single" w:sz="16" w:space="0" w:color="D3D3D3"/>
-              <w:start w:val="single" w:space="0" w:color="D3D3D3"/>
-            </w:tcBorders>
-          </w:tcPr>
-          <w:p>
-            <w:pPr>
-              <w:spacing w:before="0" w:after="60"/>
-              <w:keepNext/>
-              <w:jc w:val="end"/>
-            </w:pPr>
-            <w:r>
-              <w:rPr>
-                <w:rFonts w:ascii="Calibri" w:hAnsi="Calibri"/>
-                <w:sz w:val="20"/>
-              </w:rPr>
-              <w:t xml:space="default">estimate</w:t>
-            </w:r>
-          </w:p>
-        </w:tc>
-        <w:tc>
-          <w:tcPr>
-            <w:tcBorders>
-              <w:top w:val="single" w:sz="16" w:space="0" w:color="D3D3D3"/>
-              <w:bottom w:val="single" w:sz="16" w:space="0" w:color="D3D3D3"/>
-            </w:tcBorders>
-          </w:tcPr>
-          <w:p>
-            <w:pPr>
-              <w:spacing w:before="0" w:after="60"/>
-              <w:keepNext/>
-              <w:jc w:val="end"/>
-            </w:pPr>
-            <w:r>
-              <w:rPr>
-                <w:rFonts w:ascii="Calibri" w:hAnsi="Calibri"/>
-                <w:sz w:val="20"/>
-              </w:rPr>
-              <w:t xml:space="default">statistic</w:t>
-            </w:r>
-          </w:p>
-        </w:tc>
-        <w:tc>
-          <w:tcPr>
-            <w:tcBorders>
-              <w:top w:val="single" w:sz="16" w:space="0" w:color="D3D3D3"/>
-              <w:bottom w:val="single" w:sz="16" w:space="0" w:color="D3D3D3"/>
-            </w:tcBorders>
-          </w:tcPr>
-          <w:p>
-            <w:pPr>
-              <w:spacing w:before="0" w:after="60"/>
-              <w:keepNext/>
-              <w:jc w:val="end"/>
-            </w:pPr>
-            <w:r>
-              <w:rPr>
-                <w:rFonts w:ascii="Calibri" w:hAnsi="Calibri"/>
-                <w:sz w:val="20"/>
-              </w:rPr>
-              <w:t xml:space="default">p.value</w:t>
-            </w:r>
-          </w:p>
-        </w:tc>
-        <w:tc>
-          <w:tcPr>
-            <w:tcBorders>
-              <w:top w:val="single" w:sz="16" w:space="0" w:color="D3D3D3"/>
-              <w:bottom w:val="single" w:sz="16" w:space="0" w:color="D3D3D3"/>
-            </w:tcBorders>
-          </w:tcPr>
-          <w:p>
-            <w:pPr>
-              <w:spacing w:before="0" w:after="60"/>
-              <w:keepNext/>
-              <w:jc w:val="end"/>
-            </w:pPr>
-            <w:r>
-              <w:rPr>
-                <w:rFonts w:ascii="Calibri" w:hAnsi="Calibri"/>
-                <w:sz w:val="20"/>
-              </w:rPr>
-              <w:t xml:space="default">parameter</w:t>
-            </w:r>
-          </w:p>
-        </w:tc>
-        <w:tc>
-          <w:tcPr>
-            <w:tcBorders>
-              <w:top w:val="single" w:sz="16" w:space="0" w:color="D3D3D3"/>
-              <w:bottom w:val="single" w:sz="16" w:space="0" w:color="D3D3D3"/>
-            </w:tcBorders>
-          </w:tcPr>
-          <w:p>
-            <w:pPr>
-              <w:spacing w:before="0" w:after="60"/>
-              <w:keepNext/>
-              <w:jc w:val="end"/>
-            </w:pPr>
-            <w:r>
-              <w:rPr>
-                <w:rFonts w:ascii="Calibri" w:hAnsi="Calibri"/>
-                <w:sz w:val="20"/>
-              </w:rPr>
-              <w:t xml:space="default">conf.low</w:t>
-            </w:r>
-          </w:p>
-        </w:tc>
-        <w:tc>
-          <w:tcPr>
-            <w:tcBorders>
-              <w:top w:val="single" w:sz="16" w:space="0" w:color="D3D3D3"/>
-              <w:bottom w:val="single" w:sz="16" w:space="0" w:color="D3D3D3"/>
-            </w:tcBorders>
-          </w:tcPr>
-          <w:p>
-            <w:pPr>
-              <w:spacing w:before="0" w:after="60"/>
-              <w:keepNext/>
-              <w:jc w:val="end"/>
-            </w:pPr>
-            <w:r>
-              <w:rPr>
-                <w:rFonts w:ascii="Calibri" w:hAnsi="Calibri"/>
-                <w:sz w:val="20"/>
-              </w:rPr>
-              <w:t xml:space="default">conf.high</w:t>
-            </w:r>
-          </w:p>
-        </w:tc>
-        <w:tc>
-          <w:tcPr>
-            <w:tcBorders>
-              <w:top w:val="single" w:sz="16" w:space="0" w:color="D3D3D3"/>
-              <w:bottom w:val="single" w:sz="16" w:space="0" w:color="D3D3D3"/>
-            </w:tcBorders>
-          </w:tcPr>
-          <w:p>
-            <w:pPr>
-              <w:spacing w:before="0" w:after="60"/>
-              <w:keepNext/>
-              <w:jc w:val="start"/>
-            </w:pPr>
-            <w:r>
-              <w:rPr>
-                <w:rFonts w:ascii="Calibri" w:hAnsi="Calibri"/>
-                <w:sz w:val="20"/>
-              </w:rPr>
-              <w:t xml:space="default">method</w:t>
-            </w:r>
-          </w:p>
-        </w:tc>
-        <w:tc>
-          <w:tcPr>
-            <w:tcBorders>
-              <w:top w:val="single" w:sz="16" w:space="0" w:color="D3D3D3"/>
-              <w:bottom w:val="single" w:sz="16" w:space="0" w:color="D3D3D3"/>
-              <w:end w:val="single" w:space="0" w:color="D3D3D3"/>
-            </w:tcBorders>
-          </w:tcPr>
-          <w:p>
-            <w:pPr>
-              <w:spacing w:before="0" w:after="60"/>
-              <w:keepNext/>
-              <w:jc w:val="start"/>
-            </w:pPr>
-            <w:r>
-              <w:rPr>
-                <w:rFonts w:ascii="Calibri" w:hAnsi="Calibri"/>
-                <w:sz w:val="20"/>
-              </w:rPr>
-              <w:t xml:space="default">alternative</w:t>
+              <w:t xml:space="default">CON</w:t>
+            </w:r>
+          </w:p>
+        </w:tc>
+        <w:tc>
+          <w:tcPr>
+            <w:tcBorders>
+              <w:top w:val="single" w:space="0" w:color="D3D3D3"/>
+              <w:bottom w:val="single" w:space="0" w:color="D3D3D3"/>
+              <w:start w:val="single" w:space="0" w:color="D3D3D3"/>
+              <w:end w:val="single" w:space="0" w:color="D3D3D3"/>
+            </w:tcBorders>
+          </w:tcPr>
+          <w:p>
+            <w:pPr>
+              <w:spacing w:before="0" w:after="60"/>
+              <w:keepNext/>
+              <w:jc w:val="start"/>
+            </w:pPr>
+            <w:r>
+              <w:rPr>
+                <w:rFonts w:ascii="Calibri" w:hAnsi="Calibri"/>
+                <w:sz w:val="20"/>
+              </w:rPr>
+              <w:t xml:space="default">-0.3972</w:t>
+            </w:r>
+          </w:p>
+        </w:tc>
+        <w:tc>
+          <w:tcPr>
+            <w:tcBorders>
+              <w:top w:val="single" w:space="0" w:color="D3D3D3"/>
+              <w:bottom w:val="single" w:space="0" w:color="D3D3D3"/>
+              <w:start w:val="single" w:space="0" w:color="D3D3D3"/>
+              <w:end w:val="single" w:space="0" w:color="D3D3D3"/>
+            </w:tcBorders>
+          </w:tcPr>
+          <w:p>
+            <w:pPr>
+              <w:spacing w:before="0" w:after="60"/>
+              <w:keepNext/>
+              <w:jc w:val="start"/>
+            </w:pPr>
+            <w:r>
+              <w:rPr>
+                <w:rFonts w:ascii="Calibri" w:hAnsi="Calibri"/>
+                <w:sz w:val="20"/>
+              </w:rPr>
+              <w:t xml:space="default">-1.3687</w:t>
+            </w:r>
+          </w:p>
+        </w:tc>
+        <w:tc>
+          <w:tcPr>
+            <w:tcBorders>
+              <w:top w:val="single" w:space="0" w:color="D3D3D3"/>
+              <w:bottom w:val="single" w:space="0" w:color="D3D3D3"/>
+              <w:start w:val="single" w:space="0" w:color="D3D3D3"/>
+              <w:end w:val="single" w:space="0" w:color="D3D3D3"/>
+            </w:tcBorders>
+          </w:tcPr>
+          <w:p>
+            <w:pPr>
+              <w:spacing w:before="0" w:after="60"/>
+              <w:keepNext/>
+              <w:jc w:val="start"/>
+            </w:pPr>
+            <w:r>
+              <w:rPr>
+                <w:rFonts w:ascii="Calibri" w:hAnsi="Calibri"/>
+                <w:sz w:val="20"/>
+              </w:rPr>
+              <w:t xml:space="default">0.2010</w:t>
+            </w:r>
+          </w:p>
+        </w:tc>
+        <w:tc>
+          <w:tcPr>
+            <w:tcBorders>
+              <w:top w:val="single" w:space="0" w:color="D3D3D3"/>
+              <w:bottom w:val="single" w:space="0" w:color="D3D3D3"/>
+              <w:start w:val="single" w:space="0" w:color="D3D3D3"/>
+              <w:end w:val="single" w:space="0" w:color="D3D3D3"/>
+            </w:tcBorders>
+          </w:tcPr>
+          <w:p>
+            <w:pPr>
+              <w:spacing w:before="0" w:after="60"/>
+              <w:keepNext/>
+              <w:jc w:val="start"/>
+            </w:pPr>
+            <w:r>
+              <w:rPr>
+                <w:rFonts w:ascii="Calibri" w:hAnsi="Calibri"/>
+                <w:sz w:val="20"/>
+              </w:rPr>
+              <w:t xml:space="default">10.0000</w:t>
+            </w:r>
+          </w:p>
+        </w:tc>
+        <w:tc>
+          <w:tcPr>
+            <w:tcBorders>
+              <w:top w:val="single" w:space="0" w:color="D3D3D3"/>
+              <w:bottom w:val="single" w:space="0" w:color="D3D3D3"/>
+              <w:start w:val="single" w:space="0" w:color="D3D3D3"/>
+              <w:end w:val="single" w:space="0" w:color="D3D3D3"/>
+            </w:tcBorders>
+          </w:tcPr>
+          <w:p>
+            <w:pPr>
+              <w:spacing w:before="0" w:after="60"/>
+              <w:keepNext/>
+              <w:jc w:val="start"/>
+            </w:pPr>
+            <w:r>
+              <w:rPr>
+                <w:rFonts w:ascii="Calibri" w:hAnsi="Calibri"/>
+                <w:sz w:val="20"/>
+              </w:rPr>
+              <w:t xml:space="default">-0.7908</w:t>
+            </w:r>
+          </w:p>
+        </w:tc>
+        <w:tc>
+          <w:tcPr>
+            <w:tcBorders>
+              <w:top w:val="single" w:space="0" w:color="D3D3D3"/>
+              <w:bottom w:val="single" w:space="0" w:color="D3D3D3"/>
+              <w:start w:val="single" w:space="0" w:color="D3D3D3"/>
+              <w:end w:val="single" w:space="0" w:color="D3D3D3"/>
+            </w:tcBorders>
+          </w:tcPr>
+          <w:p>
+            <w:pPr>
+              <w:spacing w:before="0" w:after="60"/>
+              <w:keepNext/>
+              <w:jc w:val="start"/>
+            </w:pPr>
+            <w:r>
+              <w:rPr>
+                <w:rFonts w:ascii="Calibri" w:hAnsi="Calibri"/>
+                <w:sz w:val="20"/>
+              </w:rPr>
+              <w:t xml:space="default">0.2288</w:t>
+            </w:r>
+          </w:p>
+        </w:tc>
+        <w:tc>
+          <w:tcPr>
+            <w:tcBorders>
+              <w:top w:val="single" w:space="0" w:color="D3D3D3"/>
+              <w:bottom w:val="single" w:space="0" w:color="D3D3D3"/>
+              <w:start w:val="single" w:space="0" w:color="D3D3D3"/>
+              <w:end w:val="single" w:space="0" w:color="D3D3D3"/>
+            </w:tcBorders>
+          </w:tcPr>
+          <w:p>
+            <w:pPr>
+              <w:spacing w:before="0" w:after="60"/>
+              <w:keepNext/>
+              <w:jc w:val="start"/>
+            </w:pPr>
+            <w:r>
+              <w:rPr>
+                <w:rFonts w:ascii="Calibri" w:hAnsi="Calibri"/>
+                <w:sz w:val="20"/>
+              </w:rPr>
+              <w:t xml:space="default">Pearson's product-moment correlation</w:t>
+            </w:r>
+          </w:p>
+        </w:tc>
+        <w:tc>
+          <w:tcPr>
+            <w:tcBorders>
+              <w:top w:val="single" w:space="0" w:color="D3D3D3"/>
+              <w:bottom w:val="single" w:space="0" w:color="D3D3D3"/>
+              <w:start w:val="single" w:space="0" w:color="D3D3D3"/>
+              <w:end w:val="single" w:space="0" w:color="D3D3D3"/>
+            </w:tcBorders>
+          </w:tcPr>
+          <w:p>
+            <w:pPr>
+              <w:spacing w:before="0" w:after="60"/>
+              <w:keepNext/>
+              <w:jc w:val="start"/>
+            </w:pPr>
+            <w:r>
+              <w:rPr>
+                <w:rFonts w:ascii="Calibri" w:hAnsi="Calibri"/>
+                <w:sz w:val="20"/>
+              </w:rPr>
+              <w:t xml:space="default">two.sided</w:t>
             </w:r>
           </w:p>
         </w:tc>
@@ -2072,583 +2236,158 @@
             <w:pPr>
               <w:spacing w:before="0" w:after="60"/>
               <w:keepNext/>
-              <w:jc w:val="end"/>
-            </w:pPr>
-            <w:r>
-              <w:rPr>
-                <w:rFonts w:ascii="Calibri" w:hAnsi="Calibri"/>
-                <w:sz w:val="20"/>
-              </w:rPr>
-              <w:t xml:space="default">-0.3972223</w:t>
-            </w:r>
-          </w:p>
-        </w:tc>
-        <w:tc>
-          <w:tcPr>
-            <w:tcBorders>
-              <w:top w:val="single" w:space="0" w:color="D3D3D3"/>
-              <w:bottom w:val="single" w:space="0" w:color="D3D3D3"/>
-              <w:start w:val="single" w:space="0" w:color="D3D3D3"/>
-              <w:end w:val="single" w:space="0" w:color="D3D3D3"/>
-            </w:tcBorders>
-          </w:tcPr>
-          <w:p>
-            <w:pPr>
-              <w:spacing w:before="0" w:after="60"/>
-              <w:keepNext/>
-              <w:jc w:val="end"/>
-            </w:pPr>
-            <w:r>
-              <w:rPr>
-                <w:rFonts w:ascii="Calibri" w:hAnsi="Calibri"/>
-                <w:sz w:val="20"/>
-              </w:rPr>
-              <w:t xml:space="default">-1.368744</w:t>
-            </w:r>
-          </w:p>
-        </w:tc>
-        <w:tc>
-          <w:tcPr>
-            <w:tcBorders>
-              <w:top w:val="single" w:space="0" w:color="D3D3D3"/>
-              <w:bottom w:val="single" w:space="0" w:color="D3D3D3"/>
-              <w:start w:val="single" w:space="0" w:color="D3D3D3"/>
-              <w:end w:val="single" w:space="0" w:color="D3D3D3"/>
-            </w:tcBorders>
-          </w:tcPr>
-          <w:p>
-            <w:pPr>
-              <w:spacing w:before="0" w:after="60"/>
-              <w:keepNext/>
-              <w:jc w:val="end"/>
-            </w:pPr>
-            <w:r>
-              <w:rPr>
-                <w:rFonts w:ascii="Calibri" w:hAnsi="Calibri"/>
-                <w:sz w:val="20"/>
-              </w:rPr>
-              <w:t xml:space="default">0.2010386</w:t>
-            </w:r>
-          </w:p>
-        </w:tc>
-        <w:tc>
-          <w:tcPr>
-            <w:tcBorders>
-              <w:top w:val="single" w:space="0" w:color="D3D3D3"/>
-              <w:bottom w:val="single" w:space="0" w:color="D3D3D3"/>
-              <w:start w:val="single" w:space="0" w:color="D3D3D3"/>
-              <w:end w:val="single" w:space="0" w:color="D3D3D3"/>
-            </w:tcBorders>
-          </w:tcPr>
-          <w:p>
-            <w:pPr>
-              <w:spacing w:before="0" w:after="60"/>
-              <w:keepNext/>
-              <w:jc w:val="end"/>
-            </w:pPr>
-            <w:r>
-              <w:rPr>
-                <w:rFonts w:ascii="Calibri" w:hAnsi="Calibri"/>
-                <w:sz w:val="20"/>
-              </w:rPr>
-              <w:t xml:space="default">10</w:t>
-            </w:r>
-          </w:p>
-        </w:tc>
-        <w:tc>
-          <w:tcPr>
-            <w:tcBorders>
-              <w:top w:val="single" w:space="0" w:color="D3D3D3"/>
-              <w:bottom w:val="single" w:space="0" w:color="D3D3D3"/>
-              <w:start w:val="single" w:space="0" w:color="D3D3D3"/>
-              <w:end w:val="single" w:space="0" w:color="D3D3D3"/>
-            </w:tcBorders>
-          </w:tcPr>
-          <w:p>
-            <w:pPr>
-              <w:spacing w:before="0" w:after="60"/>
-              <w:keepNext/>
-              <w:jc w:val="end"/>
-            </w:pPr>
-            <w:r>
-              <w:rPr>
-                <w:rFonts w:ascii="Calibri" w:hAnsi="Calibri"/>
-                <w:sz w:val="20"/>
-              </w:rPr>
-              <w:t xml:space="default">-0.7908391</w:t>
-            </w:r>
-          </w:p>
-        </w:tc>
-        <w:tc>
-          <w:tcPr>
-            <w:tcBorders>
-              <w:top w:val="single" w:space="0" w:color="D3D3D3"/>
-              <w:bottom w:val="single" w:space="0" w:color="D3D3D3"/>
-              <w:start w:val="single" w:space="0" w:color="D3D3D3"/>
-              <w:end w:val="single" w:space="0" w:color="D3D3D3"/>
-            </w:tcBorders>
-          </w:tcPr>
-          <w:p>
-            <w:pPr>
-              <w:spacing w:before="0" w:after="60"/>
-              <w:keepNext/>
-              <w:jc w:val="end"/>
-            </w:pPr>
-            <w:r>
-              <w:rPr>
-                <w:rFonts w:ascii="Calibri" w:hAnsi="Calibri"/>
-                <w:sz w:val="20"/>
-              </w:rPr>
-              <w:t xml:space="default">0.2288492</w:t>
-            </w:r>
-          </w:p>
-        </w:tc>
-        <w:tc>
-          <w:tcPr>
-            <w:tcBorders>
-              <w:top w:val="single" w:space="0" w:color="D3D3D3"/>
-              <w:bottom w:val="single" w:space="0" w:color="D3D3D3"/>
-              <w:start w:val="single" w:space="0" w:color="D3D3D3"/>
-              <w:end w:val="single" w:space="0" w:color="D3D3D3"/>
-            </w:tcBorders>
-          </w:tcPr>
-          <w:p>
-            <w:pPr>
-              <w:spacing w:before="0" w:after="60"/>
-              <w:keepNext/>
-              <w:jc w:val="start"/>
-            </w:pPr>
-            <w:r>
-              <w:rPr>
-                <w:rFonts w:ascii="Calibri" w:hAnsi="Calibri"/>
-                <w:sz w:val="20"/>
-              </w:rPr>
-              <w:t xml:space="default">Pearson's product-moment correlation</w:t>
-            </w:r>
-          </w:p>
-        </w:tc>
-        <w:tc>
-          <w:tcPr>
-            <w:tcBorders>
-              <w:top w:val="single" w:space="0" w:color="D3D3D3"/>
-              <w:bottom w:val="single" w:space="0" w:color="D3D3D3"/>
-              <w:start w:val="single" w:space="0" w:color="D3D3D3"/>
-              <w:end w:val="single" w:space="0" w:color="D3D3D3"/>
-            </w:tcBorders>
-          </w:tcPr>
-          <w:p>
-            <w:pPr>
-              <w:spacing w:before="0" w:after="60"/>
-              <w:keepNext/>
-              <w:jc w:val="start"/>
-            </w:pPr>
-            <w:r>
-              <w:rPr>
-                <w:rFonts w:ascii="Calibri" w:hAnsi="Calibri"/>
-                <w:sz w:val="20"/>
-              </w:rPr>
-              <w:t xml:space="default">two.sided</w:t>
-            </w:r>
-          </w:p>
-        </w:tc>
-      </w:tr>
-    </w:tbl>
-    <w:p>
-      <w:r>
-        <w:br w:type="page"/>
-      </w:r>
-    </w:p>
-    <w:p>
-      <w:pPr>
-        <w:spacing w:before="0" w:after="60"/>
-        <w:keepNext/>
-        <w:jc w:val="start"/>
-        <w:pStyle w:val="caption"/>
-      </w:pPr>
-      <w:r>
-        <w:rPr>
-          <w:rFonts w:ascii="Calibri" w:hAnsi="Calibri"/>
-          <w:sz w:val="24"/>
-        </w:rPr>
-        <w:t xml:space="preserve">Table </w:t>
-      </w:r>
-      <w:r>
-        <w:fldChar w:fldCharType="begin" w:dirty="true"/>
-      </w:r>
-      <w:r>
-        <w:instrText xml:space="preserve" w:dirty="true"> SEQ Table \* ARABIC </w:instrText>
-      </w:r>
-      <w:r>
-        <w:fldChar w:fldCharType="separate" w:dirty="true"/>
-      </w:r>
-      <w:r>
-        <w:rPr>
-          <w:noProof/>
-          <w:rFonts w:ascii="Calibri" w:hAnsi="Calibri"/>
-          <w:sz w:val="24"/>
-        </w:rPr>
-        <w:t xml:space="default">1</w:t>
-      </w:r>
-      <w:r>
-        <w:fldChar w:fldCharType="end" w:dirty="true"/>
-      </w:r>
-      <w:r>
-        <w:rPr>
-          <w:rFonts w:ascii="Calibri" w:hAnsi="Calibri"/>
-          <w:sz w:val="24"/>
-        </w:rPr>
-        <w:t xml:space="preserve">: </w:t>
-      </w:r>
-      <w:r>
-        <w:rPr>
-          <w:rFonts w:ascii="Calibri" w:hAnsi="Calibri"/>
-          <w:sz w:val="24"/>
-          <w:color w:val="333333"/>
-        </w:rPr>
-        <w:t xml:space="default">Correlation of female population size and total fecundity: FP</w:t>
-      </w:r>
-    </w:p>
-    <w:tbl xmlns:w="http://schemas.openxmlformats.org/wordprocessingml/2006/main" xmlns:wp="http://schemas.openxmlformats.org/drawingml/2006/wordprocessingDrawing" xmlns:r="http://schemas.openxmlformats.org/officeDocument/2006/relationships" xmlns:w14="http://schemas.microsoft.com/office/word/2010/wordml">
-      <w:tblPr>
-        <w:tblCellMar>
-          <w:top w:w="0" w:type="dxa"/>
-          <w:bottom w:w="0" w:type="dxa"/>
-          <w:start w:w="60" w:type="dxa"/>
-          <w:end w:w="60" w:type="dxa"/>
-        </w:tblCellMar>
-        <w:tblW w:type="auto" w:w="0"/>
-        <w:tblLook w:firstRow="0" w:lastRow="0" w:firstColumn="0" w:lastColumn="0" w:noHBand="0" w:noVBand="0"/>
-        <w:jc w:val="center"/>
-      </w:tblPr>
-      <w:tr>
-        <w:trPr>
-          <w:cantSplit/>
-          <w:tblHeader/>
-        </w:trPr>
-        <w:tc>
-          <w:tcPr>
-            <w:tcBorders>
-              <w:top w:val="single" w:sz="16" w:space="0" w:color="D3D3D3"/>
-              <w:bottom w:val="single" w:sz="16" w:space="0" w:color="D3D3D3"/>
-              <w:start w:val="single" w:space="0" w:color="D3D3D3"/>
-            </w:tcBorders>
-          </w:tcPr>
-          <w:p>
-            <w:pPr>
-              <w:spacing w:before="0" w:after="60"/>
-              <w:keepNext/>
-              <w:jc w:val="end"/>
-            </w:pPr>
-            <w:r>
-              <w:rPr>
-                <w:rFonts w:ascii="Calibri" w:hAnsi="Calibri"/>
-                <w:sz w:val="20"/>
-              </w:rPr>
-              <w:t xml:space="default">estimate</w:t>
-            </w:r>
-          </w:p>
-        </w:tc>
-        <w:tc>
-          <w:tcPr>
-            <w:tcBorders>
-              <w:top w:val="single" w:sz="16" w:space="0" w:color="D3D3D3"/>
-              <w:bottom w:val="single" w:sz="16" w:space="0" w:color="D3D3D3"/>
-            </w:tcBorders>
-          </w:tcPr>
-          <w:p>
-            <w:pPr>
-              <w:spacing w:before="0" w:after="60"/>
-              <w:keepNext/>
-              <w:jc w:val="end"/>
-            </w:pPr>
-            <w:r>
-              <w:rPr>
-                <w:rFonts w:ascii="Calibri" w:hAnsi="Calibri"/>
-                <w:sz w:val="20"/>
-              </w:rPr>
-              <w:t xml:space="default">statistic</w:t>
-            </w:r>
-          </w:p>
-        </w:tc>
-        <w:tc>
-          <w:tcPr>
-            <w:tcBorders>
-              <w:top w:val="single" w:sz="16" w:space="0" w:color="D3D3D3"/>
-              <w:bottom w:val="single" w:sz="16" w:space="0" w:color="D3D3D3"/>
-            </w:tcBorders>
-          </w:tcPr>
-          <w:p>
-            <w:pPr>
-              <w:spacing w:before="0" w:after="60"/>
-              <w:keepNext/>
-              <w:jc w:val="end"/>
-            </w:pPr>
-            <w:r>
-              <w:rPr>
-                <w:rFonts w:ascii="Calibri" w:hAnsi="Calibri"/>
-                <w:sz w:val="20"/>
-              </w:rPr>
-              <w:t xml:space="default">p.value</w:t>
-            </w:r>
-          </w:p>
-        </w:tc>
-        <w:tc>
-          <w:tcPr>
-            <w:tcBorders>
-              <w:top w:val="single" w:sz="16" w:space="0" w:color="D3D3D3"/>
-              <w:bottom w:val="single" w:sz="16" w:space="0" w:color="D3D3D3"/>
-            </w:tcBorders>
-          </w:tcPr>
-          <w:p>
-            <w:pPr>
-              <w:spacing w:before="0" w:after="60"/>
-              <w:keepNext/>
-              <w:jc w:val="end"/>
-            </w:pPr>
-            <w:r>
-              <w:rPr>
-                <w:rFonts w:ascii="Calibri" w:hAnsi="Calibri"/>
-                <w:sz w:val="20"/>
-              </w:rPr>
-              <w:t xml:space="default">parameter</w:t>
-            </w:r>
-          </w:p>
-        </w:tc>
-        <w:tc>
-          <w:tcPr>
-            <w:tcBorders>
-              <w:top w:val="single" w:sz="16" w:space="0" w:color="D3D3D3"/>
-              <w:bottom w:val="single" w:sz="16" w:space="0" w:color="D3D3D3"/>
-            </w:tcBorders>
-          </w:tcPr>
-          <w:p>
-            <w:pPr>
-              <w:spacing w:before="0" w:after="60"/>
-              <w:keepNext/>
-              <w:jc w:val="end"/>
-            </w:pPr>
-            <w:r>
-              <w:rPr>
-                <w:rFonts w:ascii="Calibri" w:hAnsi="Calibri"/>
-                <w:sz w:val="20"/>
-              </w:rPr>
-              <w:t xml:space="default">conf.low</w:t>
-            </w:r>
-          </w:p>
-        </w:tc>
-        <w:tc>
-          <w:tcPr>
-            <w:tcBorders>
-              <w:top w:val="single" w:sz="16" w:space="0" w:color="D3D3D3"/>
-              <w:bottom w:val="single" w:sz="16" w:space="0" w:color="D3D3D3"/>
-            </w:tcBorders>
-          </w:tcPr>
-          <w:p>
-            <w:pPr>
-              <w:spacing w:before="0" w:after="60"/>
-              <w:keepNext/>
-              <w:jc w:val="end"/>
-            </w:pPr>
-            <w:r>
-              <w:rPr>
-                <w:rFonts w:ascii="Calibri" w:hAnsi="Calibri"/>
-                <w:sz w:val="20"/>
-              </w:rPr>
-              <w:t xml:space="default">conf.high</w:t>
-            </w:r>
-          </w:p>
-        </w:tc>
-        <w:tc>
-          <w:tcPr>
-            <w:tcBorders>
-              <w:top w:val="single" w:sz="16" w:space="0" w:color="D3D3D3"/>
-              <w:bottom w:val="single" w:sz="16" w:space="0" w:color="D3D3D3"/>
-            </w:tcBorders>
-          </w:tcPr>
-          <w:p>
-            <w:pPr>
-              <w:spacing w:before="0" w:after="60"/>
-              <w:keepNext/>
-              <w:jc w:val="start"/>
-            </w:pPr>
-            <w:r>
-              <w:rPr>
-                <w:rFonts w:ascii="Calibri" w:hAnsi="Calibri"/>
-                <w:sz w:val="20"/>
-              </w:rPr>
-              <w:t xml:space="default">method</w:t>
-            </w:r>
-          </w:p>
-        </w:tc>
-        <w:tc>
-          <w:tcPr>
-            <w:tcBorders>
-              <w:top w:val="single" w:sz="16" w:space="0" w:color="D3D3D3"/>
-              <w:bottom w:val="single" w:sz="16" w:space="0" w:color="D3D3D3"/>
-              <w:end w:val="single" w:space="0" w:color="D3D3D3"/>
-            </w:tcBorders>
-          </w:tcPr>
-          <w:p>
-            <w:pPr>
-              <w:spacing w:before="0" w:after="60"/>
-              <w:keepNext/>
-              <w:jc w:val="start"/>
-            </w:pPr>
-            <w:r>
-              <w:rPr>
-                <w:rFonts w:ascii="Calibri" w:hAnsi="Calibri"/>
-                <w:sz w:val="20"/>
-              </w:rPr>
-              <w:t xml:space="default">alternative</w:t>
-            </w:r>
-          </w:p>
-        </w:tc>
-      </w:tr>
-      <w:tr>
-        <w:trPr>
-          <w:cantSplit/>
-        </w:trPr>
-        <w:tc>
-          <w:tcPr>
-            <w:tcBorders>
-              <w:top w:val="single" w:space="0" w:color="D3D3D3"/>
-              <w:bottom w:val="single" w:space="0" w:color="D3D3D3"/>
-              <w:start w:val="single" w:space="0" w:color="D3D3D3"/>
-              <w:end w:val="single" w:space="0" w:color="D3D3D3"/>
-            </w:tcBorders>
-          </w:tcPr>
-          <w:p>
-            <w:pPr>
-              <w:spacing w:before="0" w:after="60"/>
-              <w:keepNext/>
-              <w:jc w:val="end"/>
-            </w:pPr>
-            <w:r>
-              <w:rPr>
-                <w:rFonts w:ascii="Calibri" w:hAnsi="Calibri"/>
-                <w:sz w:val="20"/>
-              </w:rPr>
-              <w:t xml:space="default">-0.04035109</w:t>
-            </w:r>
-          </w:p>
-        </w:tc>
-        <w:tc>
-          <w:tcPr>
-            <w:tcBorders>
-              <w:top w:val="single" w:space="0" w:color="D3D3D3"/>
-              <w:bottom w:val="single" w:space="0" w:color="D3D3D3"/>
-              <w:start w:val="single" w:space="0" w:color="D3D3D3"/>
-              <w:end w:val="single" w:space="0" w:color="D3D3D3"/>
-            </w:tcBorders>
-          </w:tcPr>
-          <w:p>
-            <w:pPr>
-              <w:spacing w:before="0" w:after="60"/>
-              <w:keepNext/>
-              <w:jc w:val="end"/>
-            </w:pPr>
-            <w:r>
-              <w:rPr>
-                <w:rFonts w:ascii="Calibri" w:hAnsi="Calibri"/>
-                <w:sz w:val="20"/>
-              </w:rPr>
-              <w:t xml:space="default">-0.1277053</w:t>
-            </w:r>
-          </w:p>
-        </w:tc>
-        <w:tc>
-          <w:tcPr>
-            <w:tcBorders>
-              <w:top w:val="single" w:space="0" w:color="D3D3D3"/>
-              <w:bottom w:val="single" w:space="0" w:color="D3D3D3"/>
-              <w:start w:val="single" w:space="0" w:color="D3D3D3"/>
-              <w:end w:val="single" w:space="0" w:color="D3D3D3"/>
-            </w:tcBorders>
-          </w:tcPr>
-          <w:p>
-            <w:pPr>
-              <w:spacing w:before="0" w:after="60"/>
-              <w:keepNext/>
-              <w:jc w:val="end"/>
-            </w:pPr>
-            <w:r>
-              <w:rPr>
-                <w:rFonts w:ascii="Calibri" w:hAnsi="Calibri"/>
-                <w:sz w:val="20"/>
-              </w:rPr>
-              <w:t xml:space="default">0.9009138</w:t>
-            </w:r>
-          </w:p>
-        </w:tc>
-        <w:tc>
-          <w:tcPr>
-            <w:tcBorders>
-              <w:top w:val="single" w:space="0" w:color="D3D3D3"/>
-              <w:bottom w:val="single" w:space="0" w:color="D3D3D3"/>
-              <w:start w:val="single" w:space="0" w:color="D3D3D3"/>
-              <w:end w:val="single" w:space="0" w:color="D3D3D3"/>
-            </w:tcBorders>
-          </w:tcPr>
-          <w:p>
-            <w:pPr>
-              <w:spacing w:before="0" w:after="60"/>
-              <w:keepNext/>
-              <w:jc w:val="end"/>
-            </w:pPr>
-            <w:r>
-              <w:rPr>
-                <w:rFonts w:ascii="Calibri" w:hAnsi="Calibri"/>
-                <w:sz w:val="20"/>
-              </w:rPr>
-              <w:t xml:space="default">10</w:t>
-            </w:r>
-          </w:p>
-        </w:tc>
-        <w:tc>
-          <w:tcPr>
-            <w:tcBorders>
-              <w:top w:val="single" w:space="0" w:color="D3D3D3"/>
-              <w:bottom w:val="single" w:space="0" w:color="D3D3D3"/>
-              <w:start w:val="single" w:space="0" w:color="D3D3D3"/>
-              <w:end w:val="single" w:space="0" w:color="D3D3D3"/>
-            </w:tcBorders>
-          </w:tcPr>
-          <w:p>
-            <w:pPr>
-              <w:spacing w:before="0" w:after="60"/>
-              <w:keepNext/>
-              <w:jc w:val="end"/>
-            </w:pPr>
-            <w:r>
-              <w:rPr>
-                <w:rFonts w:ascii="Calibri" w:hAnsi="Calibri"/>
-                <w:sz w:val="20"/>
-              </w:rPr>
-              <w:t xml:space="default">-0.6003501</w:t>
-            </w:r>
-          </w:p>
-        </w:tc>
-        <w:tc>
-          <w:tcPr>
-            <w:tcBorders>
-              <w:top w:val="single" w:space="0" w:color="D3D3D3"/>
-              <w:bottom w:val="single" w:space="0" w:color="D3D3D3"/>
-              <w:start w:val="single" w:space="0" w:color="D3D3D3"/>
-              <w:end w:val="single" w:space="0" w:color="D3D3D3"/>
-            </w:tcBorders>
-          </w:tcPr>
-          <w:p>
-            <w:pPr>
-              <w:spacing w:before="0" w:after="60"/>
-              <w:keepNext/>
-              <w:jc w:val="end"/>
-            </w:pPr>
-            <w:r>
-              <w:rPr>
-                <w:rFonts w:ascii="Calibri" w:hAnsi="Calibri"/>
-                <w:sz w:val="20"/>
-              </w:rPr>
-              <w:t xml:space="default">0.5461992</w:t>
+              <w:jc w:val="start"/>
+            </w:pPr>
+            <w:r>
+              <w:rPr>
+                <w:rFonts w:ascii="Calibri" w:hAnsi="Calibri"/>
+                <w:sz w:val="20"/>
+              </w:rPr>
+              <w:t xml:space="default">FP</w:t>
+            </w:r>
+          </w:p>
+        </w:tc>
+        <w:tc>
+          <w:tcPr>
+            <w:tcBorders>
+              <w:top w:val="single" w:space="0" w:color="D3D3D3"/>
+              <w:bottom w:val="single" w:space="0" w:color="D3D3D3"/>
+              <w:start w:val="single" w:space="0" w:color="D3D3D3"/>
+              <w:end w:val="single" w:space="0" w:color="D3D3D3"/>
+            </w:tcBorders>
+          </w:tcPr>
+          <w:p>
+            <w:pPr>
+              <w:spacing w:before="0" w:after="60"/>
+              <w:keepNext/>
+              <w:jc w:val="start"/>
+            </w:pPr>
+            <w:r>
+              <w:rPr>
+                <w:rFonts w:ascii="Calibri" w:hAnsi="Calibri"/>
+                <w:sz w:val="20"/>
+              </w:rPr>
+              <w:t xml:space="default">-0.0404</w:t>
+            </w:r>
+          </w:p>
+        </w:tc>
+        <w:tc>
+          <w:tcPr>
+            <w:tcBorders>
+              <w:top w:val="single" w:space="0" w:color="D3D3D3"/>
+              <w:bottom w:val="single" w:space="0" w:color="D3D3D3"/>
+              <w:start w:val="single" w:space="0" w:color="D3D3D3"/>
+              <w:end w:val="single" w:space="0" w:color="D3D3D3"/>
+            </w:tcBorders>
+          </w:tcPr>
+          <w:p>
+            <w:pPr>
+              <w:spacing w:before="0" w:after="60"/>
+              <w:keepNext/>
+              <w:jc w:val="start"/>
+            </w:pPr>
+            <w:r>
+              <w:rPr>
+                <w:rFonts w:ascii="Calibri" w:hAnsi="Calibri"/>
+                <w:sz w:val="20"/>
+              </w:rPr>
+              <w:t xml:space="default">-0.1277</w:t>
+            </w:r>
+          </w:p>
+        </w:tc>
+        <w:tc>
+          <w:tcPr>
+            <w:tcBorders>
+              <w:top w:val="single" w:space="0" w:color="D3D3D3"/>
+              <w:bottom w:val="single" w:space="0" w:color="D3D3D3"/>
+              <w:start w:val="single" w:space="0" w:color="D3D3D3"/>
+              <w:end w:val="single" w:space="0" w:color="D3D3D3"/>
+            </w:tcBorders>
+          </w:tcPr>
+          <w:p>
+            <w:pPr>
+              <w:spacing w:before="0" w:after="60"/>
+              <w:keepNext/>
+              <w:jc w:val="start"/>
+            </w:pPr>
+            <w:r>
+              <w:rPr>
+                <w:rFonts w:ascii="Calibri" w:hAnsi="Calibri"/>
+                <w:sz w:val="20"/>
+              </w:rPr>
+              <w:t xml:space="default">0.9009</w:t>
+            </w:r>
+          </w:p>
+        </w:tc>
+        <w:tc>
+          <w:tcPr>
+            <w:tcBorders>
+              <w:top w:val="single" w:space="0" w:color="D3D3D3"/>
+              <w:bottom w:val="single" w:space="0" w:color="D3D3D3"/>
+              <w:start w:val="single" w:space="0" w:color="D3D3D3"/>
+              <w:end w:val="single" w:space="0" w:color="D3D3D3"/>
+            </w:tcBorders>
+          </w:tcPr>
+          <w:p>
+            <w:pPr>
+              <w:spacing w:before="0" w:after="60"/>
+              <w:keepNext/>
+              <w:jc w:val="start"/>
+            </w:pPr>
+            <w:r>
+              <w:rPr>
+                <w:rFonts w:ascii="Calibri" w:hAnsi="Calibri"/>
+                <w:sz w:val="20"/>
+              </w:rPr>
+              <w:t xml:space="default">10.0000</w:t>
+            </w:r>
+          </w:p>
+        </w:tc>
+        <w:tc>
+          <w:tcPr>
+            <w:tcBorders>
+              <w:top w:val="single" w:space="0" w:color="D3D3D3"/>
+              <w:bottom w:val="single" w:space="0" w:color="D3D3D3"/>
+              <w:start w:val="single" w:space="0" w:color="D3D3D3"/>
+              <w:end w:val="single" w:space="0" w:color="D3D3D3"/>
+            </w:tcBorders>
+          </w:tcPr>
+          <w:p>
+            <w:pPr>
+              <w:spacing w:before="0" w:after="60"/>
+              <w:keepNext/>
+              <w:jc w:val="start"/>
+            </w:pPr>
+            <w:r>
+              <w:rPr>
+                <w:rFonts w:ascii="Calibri" w:hAnsi="Calibri"/>
+                <w:sz w:val="20"/>
+              </w:rPr>
+              <w:t xml:space="default">-0.6004</w:t>
+            </w:r>
+          </w:p>
+        </w:tc>
+        <w:tc>
+          <w:tcPr>
+            <w:tcBorders>
+              <w:top w:val="single" w:space="0" w:color="D3D3D3"/>
+              <w:bottom w:val="single" w:space="0" w:color="D3D3D3"/>
+              <w:start w:val="single" w:space="0" w:color="D3D3D3"/>
+              <w:end w:val="single" w:space="0" w:color="D3D3D3"/>
+            </w:tcBorders>
+          </w:tcPr>
+          <w:p>
+            <w:pPr>
+              <w:spacing w:before="0" w:after="60"/>
+              <w:keepNext/>
+              <w:jc w:val="start"/>
+            </w:pPr>
+            <w:r>
+              <w:rPr>
+                <w:rFonts w:ascii="Calibri" w:hAnsi="Calibri"/>
+                <w:sz w:val="20"/>
+              </w:rPr>
+              <w:t xml:space="default">0.5462</w:t>
             </w:r>
           </w:p>
         </w:tc>

</xml_diff>